<commit_message>
Include source docs, etc.
</commit_message>
<xml_diff>
--- a/doc/Locating rare particles or hotspots.docx
+++ b/doc/Locating rare particles or hotspots.docx
@@ -1,6 +1,6 @@
 
 <file path=word/document.xml><?xml version="1.0" encoding="utf-8"?>
-<w:document xmlns:wpc="http://schemas.microsoft.com/office/word/2010/wordprocessingCanvas" xmlns:cx="http://schemas.microsoft.com/office/drawing/2014/chartex" xmlns:cx1="http://schemas.microsoft.com/office/drawing/2015/9/8/chartex" xmlns:cx2="http://schemas.microsoft.com/office/drawing/2015/10/21/chartex" xmlns:cx3="http://schemas.microsoft.com/office/drawing/2016/5/9/chartex" xmlns:cx4="http://schemas.microsoft.com/office/drawing/2016/5/10/chartex" xmlns:cx5="http://schemas.microsoft.com/office/drawing/2016/5/11/chartex" xmlns:cx6="http://schemas.microsoft.com/office/drawing/2016/5/12/chartex" xmlns:cx7="http://schemas.microsoft.com/office/drawing/2016/5/13/chartex" xmlns:cx8="http://schemas.microsoft.com/office/drawing/2016/5/14/chartex" xmlns:mc="http://schemas.openxmlformats.org/markup-compatibility/2006" xmlns:aink="http://schemas.microsoft.com/office/drawing/2016/ink" xmlns:am3d="http://schemas.microsoft.com/office/drawing/2017/model3d" xmlns:o="urn:schemas-microsoft-com:office:office" xmlns:r="http://schemas.openxmlformats.org/officeDocument/2006/relationships" xmlns:m="http://schemas.openxmlformats.org/officeDocument/2006/math" xmlns:v="urn:schemas-microsoft-com:vml" xmlns:wp14="http://schemas.microsoft.com/office/word/2010/wordprocessingDrawing" xmlns:wp="http://schemas.openxmlformats.org/drawingml/2006/wordprocessingDrawing" xmlns:w10="urn:schemas-microsoft-com:office:word" xmlns:w="http://schemas.openxmlformats.org/wordprocessingml/2006/main" xmlns:w14="http://schemas.microsoft.com/office/word/2010/wordml" xmlns:w15="http://schemas.microsoft.com/office/word/2012/wordml" xmlns:w16cid="http://schemas.microsoft.com/office/word/2016/wordml/cid" xmlns:w16se="http://schemas.microsoft.com/office/word/2015/wordml/symex" xmlns:wpg="http://schemas.microsoft.com/office/word/2010/wordprocessingGroup" xmlns:wpi="http://schemas.microsoft.com/office/word/2010/wordprocessingInk" xmlns:wne="http://schemas.microsoft.com/office/word/2006/wordml" xmlns:wps="http://schemas.microsoft.com/office/word/2010/wordprocessingShape" mc:Ignorable="w14 w15 w16se w16cid wp14">
+<w:document xmlns:wpc="http://schemas.microsoft.com/office/word/2010/wordprocessingCanvas" xmlns:cx="http://schemas.microsoft.com/office/drawing/2014/chartex" xmlns:cx1="http://schemas.microsoft.com/office/drawing/2015/9/8/chartex" xmlns:cx2="http://schemas.microsoft.com/office/drawing/2015/10/21/chartex" xmlns:cx3="http://schemas.microsoft.com/office/drawing/2016/5/9/chartex" xmlns:cx4="http://schemas.microsoft.com/office/drawing/2016/5/10/chartex" xmlns:cx5="http://schemas.microsoft.com/office/drawing/2016/5/11/chartex" xmlns:cx6="http://schemas.microsoft.com/office/drawing/2016/5/12/chartex" xmlns:cx7="http://schemas.microsoft.com/office/drawing/2016/5/13/chartex" xmlns:cx8="http://schemas.microsoft.com/office/drawing/2016/5/14/chartex" xmlns:mc="http://schemas.openxmlformats.org/markup-compatibility/2006" xmlns:aink="http://schemas.microsoft.com/office/drawing/2016/ink" xmlns:am3d="http://schemas.microsoft.com/office/drawing/2017/model3d" xmlns:o="urn:schemas-microsoft-com:office:office" xmlns:oel="http://schemas.microsoft.com/office/2019/extlst" xmlns:r="http://schemas.openxmlformats.org/officeDocument/2006/relationships" xmlns:m="http://schemas.openxmlformats.org/officeDocument/2006/math" xmlns:v="urn:schemas-microsoft-com:vml" xmlns:wp14="http://schemas.microsoft.com/office/word/2010/wordprocessingDrawing" xmlns:wp="http://schemas.openxmlformats.org/drawingml/2006/wordprocessingDrawing" xmlns:w10="urn:schemas-microsoft-com:office:word" xmlns:w="http://schemas.openxmlformats.org/wordprocessingml/2006/main" xmlns:w14="http://schemas.microsoft.com/office/word/2010/wordml" xmlns:w15="http://schemas.microsoft.com/office/word/2012/wordml" xmlns:w16cex="http://schemas.microsoft.com/office/word/2018/wordml/cex" xmlns:w16cid="http://schemas.microsoft.com/office/word/2016/wordml/cid" xmlns:w16="http://schemas.microsoft.com/office/word/2018/wordml" xmlns:w16du="http://schemas.microsoft.com/office/word/2023/wordml/word16du" xmlns:w16sdtdh="http://schemas.microsoft.com/office/word/2020/wordml/sdtdatahash" xmlns:w16sdtfl="http://schemas.microsoft.com/office/word/2024/wordml/sdtformatlock" xmlns:w16se="http://schemas.microsoft.com/office/word/2015/wordml/symex" xmlns:wpg="http://schemas.microsoft.com/office/word/2010/wordprocessingGroup" xmlns:wpi="http://schemas.microsoft.com/office/word/2010/wordprocessingInk" xmlns:wne="http://schemas.microsoft.com/office/word/2006/wordml" xmlns:wps="http://schemas.microsoft.com/office/word/2010/wordprocessingShape" mc:Ignorable="w14 w15 w16se w16cid w16 w16cex w16sdtdh w16sdtfl w16du wp14">
   <w:body>
     <w:p>
       <w:pPr>
@@ -116,7 +116,7 @@
                     </pic:cNvPicPr>
                   </pic:nvPicPr>
                   <pic:blipFill>
-                    <a:blip r:embed="rId5" cstate="print">
+                    <a:blip r:embed="rId7" cstate="print">
                       <a:extLst>
                         <a:ext uri="{28A0092B-C50C-407E-A947-70E740481C1C}">
                           <a14:useLocalDpi xmlns:a14="http://schemas.microsoft.com/office/drawing/2010/main" val="0"/>
@@ -182,7 +182,7 @@
                     </pic:cNvPicPr>
                   </pic:nvPicPr>
                   <pic:blipFill>
-                    <a:blip r:embed="rId6" cstate="print">
+                    <a:blip r:embed="rId8" cstate="print">
                       <a:extLst>
                         <a:ext uri="{28A0092B-C50C-407E-A947-70E740481C1C}">
                           <a14:useLocalDpi xmlns:a14="http://schemas.microsoft.com/office/drawing/2010/main" val="0"/>
@@ -375,7 +375,7 @@
                     </pic:cNvPicPr>
                   </pic:nvPicPr>
                   <pic:blipFill>
-                    <a:blip r:embed="rId7">
+                    <a:blip r:embed="rId9">
                       <a:extLst>
                         <a:ext uri="{28A0092B-C50C-407E-A947-70E740481C1C}">
                           <a14:useLocalDpi xmlns:a14="http://schemas.microsoft.com/office/drawing/2010/main" val="0"/>
@@ -441,7 +441,7 @@
                     </pic:cNvPicPr>
                   </pic:nvPicPr>
                   <pic:blipFill>
-                    <a:blip r:embed="rId8">
+                    <a:blip r:embed="rId10">
                       <a:extLst>
                         <a:ext uri="{28A0092B-C50C-407E-A947-70E740481C1C}">
                           <a14:useLocalDpi xmlns:a14="http://schemas.microsoft.com/office/drawing/2010/main" val="0"/>
@@ -623,7 +623,7 @@
                     </pic:cNvPicPr>
                   </pic:nvPicPr>
                   <pic:blipFill>
-                    <a:blip r:embed="rId9">
+                    <a:blip r:embed="rId11">
                       <a:extLst>
                         <a:ext uri="{28A0092B-C50C-407E-A947-70E740481C1C}">
                           <a14:useLocalDpi xmlns:a14="http://schemas.microsoft.com/office/drawing/2010/main" val="0"/>
@@ -689,7 +689,7 @@
                     </pic:cNvPicPr>
                   </pic:nvPicPr>
                   <pic:blipFill>
-                    <a:blip r:embed="rId10">
+                    <a:blip r:embed="rId12">
                       <a:extLst>
                         <a:ext uri="{28A0092B-C50C-407E-A947-70E740481C1C}">
                           <a14:useLocalDpi xmlns:a14="http://schemas.microsoft.com/office/drawing/2010/main" val="0"/>
@@ -750,251 +750,6 @@
                 <pic:pic xmlns:pic="http://schemas.openxmlformats.org/drawingml/2006/picture">
                   <pic:nvPicPr>
                     <pic:cNvPr id="0" name="Picture 7"/>
-                    <pic:cNvPicPr>
-                      <a:picLocks noChangeAspect="1" noChangeArrowheads="1"/>
-                    </pic:cNvPicPr>
-                  </pic:nvPicPr>
-                  <pic:blipFill>
-                    <a:blip r:embed="rId11">
-                      <a:extLst>
-                        <a:ext uri="{28A0092B-C50C-407E-A947-70E740481C1C}">
-                          <a14:useLocalDpi xmlns:a14="http://schemas.microsoft.com/office/drawing/2010/main" val="0"/>
-                        </a:ext>
-                      </a:extLst>
-                    </a:blip>
-                    <a:srcRect/>
-                    <a:stretch>
-                      <a:fillRect/>
-                    </a:stretch>
-                  </pic:blipFill>
-                  <pic:spPr bwMode="auto">
-                    <a:xfrm>
-                      <a:off x="0" y="0"/>
-                      <a:ext cx="3114675" cy="1428750"/>
-                    </a:xfrm>
-                    <a:prstGeom prst="rect">
-                      <a:avLst/>
-                    </a:prstGeom>
-                    <a:noFill/>
-                    <a:ln>
-                      <a:noFill/>
-                    </a:ln>
-                  </pic:spPr>
-                </pic:pic>
-              </a:graphicData>
-            </a:graphic>
-          </wp:inline>
-        </w:drawing>
-      </w:r>
-      <w:r>
-        <w:rPr>
-          <w:rFonts w:ascii="Segoe UI" w:eastAsia="Times New Roman" w:hAnsi="Segoe UI" w:cs="Segoe UI"/>
-          <w:color w:val="172B4D"/>
-          <w:sz w:val="21"/>
-          <w:szCs w:val="21"/>
-        </w:rPr>
-        <w:t> </w:t>
-      </w:r>
-      <w:r>
-        <w:rPr>
-          <w:rFonts w:ascii="Segoe UI" w:eastAsia="Times New Roman" w:hAnsi="Segoe UI" w:cs="Segoe UI"/>
-          <w:noProof/>
-          <w:color w:val="172B4D"/>
-          <w:sz w:val="21"/>
-          <w:szCs w:val="21"/>
-        </w:rPr>
-        <w:drawing>
-          <wp:inline distT="0" distB="0" distL="0" distR="0" wp14:anchorId="5E10D940" wp14:editId="4F2112D5">
-            <wp:extent cx="1552575" cy="1428750"/>
-            <wp:effectExtent l="0" t="0" r="0" b="0"/>
-            <wp:docPr id="24" name="Picture 24"/>
-            <wp:cNvGraphicFramePr>
-              <a:graphicFrameLocks xmlns:a="http://schemas.openxmlformats.org/drawingml/2006/main" noChangeAspect="1"/>
-            </wp:cNvGraphicFramePr>
-            <a:graphic xmlns:a="http://schemas.openxmlformats.org/drawingml/2006/main">
-              <a:graphicData uri="http://schemas.openxmlformats.org/drawingml/2006/picture">
-                <pic:pic xmlns:pic="http://schemas.openxmlformats.org/drawingml/2006/picture">
-                  <pic:nvPicPr>
-                    <pic:cNvPr id="0" name="Picture 8"/>
-                    <pic:cNvPicPr>
-                      <a:picLocks noChangeAspect="1" noChangeArrowheads="1"/>
-                    </pic:cNvPicPr>
-                  </pic:nvPicPr>
-                  <pic:blipFill>
-                    <a:blip r:embed="rId12" cstate="print">
-                      <a:extLst>
-                        <a:ext uri="{28A0092B-C50C-407E-A947-70E740481C1C}">
-                          <a14:useLocalDpi xmlns:a14="http://schemas.microsoft.com/office/drawing/2010/main" val="0"/>
-                        </a:ext>
-                      </a:extLst>
-                    </a:blip>
-                    <a:srcRect/>
-                    <a:stretch>
-                      <a:fillRect/>
-                    </a:stretch>
-                  </pic:blipFill>
-                  <pic:spPr bwMode="auto">
-                    <a:xfrm>
-                      <a:off x="0" y="0"/>
-                      <a:ext cx="1552575" cy="1428750"/>
-                    </a:xfrm>
-                    <a:prstGeom prst="rect">
-                      <a:avLst/>
-                    </a:prstGeom>
-                    <a:noFill/>
-                    <a:ln>
-                      <a:noFill/>
-                    </a:ln>
-                  </pic:spPr>
-                </pic:pic>
-              </a:graphicData>
-            </a:graphic>
-          </wp:inline>
-        </w:drawing>
-      </w:r>
-    </w:p>
-    <w:p>
-      <w:pPr>
-        <w:shd w:val="clear" w:color="auto" w:fill="FFFFFF"/>
-        <w:spacing w:before="150"/>
-        <w:rPr>
-          <w:rFonts w:ascii="Segoe UI" w:eastAsia="Times New Roman" w:hAnsi="Segoe UI" w:cs="Segoe UI"/>
-          <w:color w:val="172B4D"/>
-          <w:sz w:val="21"/>
-          <w:szCs w:val="21"/>
-        </w:rPr>
-      </w:pPr>
-      <w:r>
-        <w:rPr>
-          <w:rFonts w:ascii="Segoe UI" w:eastAsia="Times New Roman" w:hAnsi="Segoe UI" w:cs="Segoe UI"/>
-          <w:i/>
-          <w:iCs/>
-          <w:color w:val="172B4D"/>
-          <w:sz w:val="21"/>
-          <w:szCs w:val="21"/>
-        </w:rPr>
-        <w:t xml:space="preserve">Associations with a Pt threshold set at ~1 </w:t>
-      </w:r>
-      <w:proofErr w:type="spellStart"/>
-      <w:r>
-        <w:rPr>
-          <w:rFonts w:ascii="Segoe UI" w:eastAsia="Times New Roman" w:hAnsi="Segoe UI" w:cs="Segoe UI"/>
-          <w:i/>
-          <w:iCs/>
-          <w:color w:val="172B4D"/>
-          <w:sz w:val="21"/>
-          <w:szCs w:val="21"/>
-        </w:rPr>
-        <w:t>wt</w:t>
-      </w:r>
-      <w:proofErr w:type="spellEnd"/>
-      <w:r>
-        <w:rPr>
-          <w:rFonts w:ascii="Segoe UI" w:eastAsia="Times New Roman" w:hAnsi="Segoe UI" w:cs="Segoe UI"/>
-          <w:i/>
-          <w:iCs/>
-          <w:color w:val="172B4D"/>
-          <w:sz w:val="21"/>
-          <w:szCs w:val="21"/>
-        </w:rPr>
-        <w:t>% apparent (left) and Pt-Bi Association showing trends of contrasting Pt/Bi (centre), Image Region window after Pt threshold, Fe showing selected pixels (right)</w:t>
-      </w:r>
-    </w:p>
-    <w:p>
-      <w:pPr>
-        <w:shd w:val="clear" w:color="auto" w:fill="FFFFFF"/>
-        <w:spacing w:before="150"/>
-        <w:rPr>
-          <w:rFonts w:ascii="Segoe UI" w:eastAsia="Times New Roman" w:hAnsi="Segoe UI" w:cs="Segoe UI"/>
-          <w:color w:val="172B4D"/>
-          <w:sz w:val="21"/>
-          <w:szCs w:val="21"/>
-        </w:rPr>
-      </w:pPr>
-      <w:r>
-        <w:rPr>
-          <w:rFonts w:ascii="Segoe UI" w:eastAsia="Times New Roman" w:hAnsi="Segoe UI" w:cs="Segoe UI"/>
-          <w:color w:val="172B4D"/>
-          <w:sz w:val="21"/>
-          <w:szCs w:val="21"/>
-        </w:rPr>
-        <w:t>The hotspots in this pixel selection can be separated into individual regions, one for each particle or hotspot, using a watershed analysis. Click on the "Hotspots" tab in the </w:t>
-      </w:r>
-      <w:r>
-        <w:rPr>
-          <w:rFonts w:ascii="Segoe UI" w:eastAsia="Times New Roman" w:hAnsi="Segoe UI" w:cs="Segoe UI"/>
-          <w:i/>
-          <w:iCs/>
-          <w:color w:val="172B4D"/>
-          <w:sz w:val="21"/>
-          <w:szCs w:val="21"/>
-        </w:rPr>
-        <w:t>Image Regions</w:t>
-      </w:r>
-      <w:r>
-        <w:rPr>
-          <w:rFonts w:ascii="Segoe UI" w:eastAsia="Times New Roman" w:hAnsi="Segoe UI" w:cs="Segoe UI"/>
-          <w:color w:val="172B4D"/>
-          <w:sz w:val="21"/>
-          <w:szCs w:val="21"/>
-        </w:rPr>
-        <w:t> window to view hotspot operations and enter "Pt" in the text box to use the XY centroids determined from the Pt analyses. Click "Hotspot separation" to calculate these (another popup will warn of the total number found; note that numbers larger than 1000 will take some time).</w:t>
-      </w:r>
-    </w:p>
-    <w:p>
-      <w:pPr>
-        <w:shd w:val="clear" w:color="auto" w:fill="FFFFFF"/>
-        <w:spacing w:before="150"/>
-        <w:rPr>
-          <w:rFonts w:ascii="Segoe UI" w:eastAsia="Times New Roman" w:hAnsi="Segoe UI" w:cs="Segoe UI"/>
-          <w:color w:val="172B4D"/>
-          <w:sz w:val="21"/>
-          <w:szCs w:val="21"/>
-        </w:rPr>
-      </w:pPr>
-      <w:r>
-        <w:rPr>
-          <w:rFonts w:ascii="Segoe UI" w:eastAsia="Times New Roman" w:hAnsi="Segoe UI" w:cs="Segoe UI"/>
-          <w:color w:val="172B4D"/>
-          <w:sz w:val="21"/>
-          <w:szCs w:val="21"/>
-        </w:rPr>
-        <w:t>The first region #0 remains as before, with all hotspots selected. Regions #1 and above are the separated hotspot regions. Remember to save the regions found to a file. The hotspot operation will suggest a suitable file-name.</w:t>
-      </w:r>
-    </w:p>
-    <w:p>
-      <w:pPr>
-        <w:shd w:val="clear" w:color="auto" w:fill="FFFFFF"/>
-        <w:spacing w:before="150"/>
-        <w:rPr>
-          <w:rFonts w:ascii="Segoe UI" w:eastAsia="Times New Roman" w:hAnsi="Segoe UI" w:cs="Segoe UI"/>
-          <w:color w:val="172B4D"/>
-          <w:sz w:val="21"/>
-          <w:szCs w:val="21"/>
-        </w:rPr>
-      </w:pPr>
-      <w:r>
-        <w:rPr>
-          <w:rFonts w:ascii="Segoe UI" w:eastAsia="Times New Roman" w:hAnsi="Segoe UI" w:cs="Segoe UI"/>
-          <w:noProof/>
-          <w:color w:val="172B4D"/>
-          <w:sz w:val="21"/>
-          <w:szCs w:val="21"/>
-        </w:rPr>
-        <w:lastRenderedPageBreak/>
-        <w:drawing>
-          <wp:inline distT="0" distB="0" distL="0" distR="0" wp14:anchorId="476B5EAA" wp14:editId="2950A4CB">
-            <wp:extent cx="3114675" cy="1428750"/>
-            <wp:effectExtent l="0" t="0" r="0" b="0"/>
-            <wp:docPr id="23" name="Picture 23"/>
-            <wp:cNvGraphicFramePr>
-              <a:graphicFrameLocks xmlns:a="http://schemas.openxmlformats.org/drawingml/2006/main" noChangeAspect="1"/>
-            </wp:cNvGraphicFramePr>
-            <a:graphic xmlns:a="http://schemas.openxmlformats.org/drawingml/2006/main">
-              <a:graphicData uri="http://schemas.openxmlformats.org/drawingml/2006/picture">
-                <pic:pic xmlns:pic="http://schemas.openxmlformats.org/drawingml/2006/picture">
-                  <pic:nvPicPr>
-                    <pic:cNvPr id="0" name="Picture 9"/>
                     <pic:cNvPicPr>
                       <a:picLocks noChangeAspect="1" noChangeArrowheads="1"/>
                     </pic:cNvPicPr>
@@ -1049,10 +804,10 @@
           <w:szCs w:val="21"/>
         </w:rPr>
         <w:drawing>
-          <wp:inline distT="0" distB="0" distL="0" distR="0" wp14:anchorId="7D1B879B" wp14:editId="231F47D4">
-            <wp:extent cx="3114675" cy="1428750"/>
+          <wp:inline distT="0" distB="0" distL="0" distR="0" wp14:anchorId="5E10D940" wp14:editId="4F2112D5">
+            <wp:extent cx="1552575" cy="1428750"/>
             <wp:effectExtent l="0" t="0" r="0" b="0"/>
-            <wp:docPr id="22" name="Picture 22"/>
+            <wp:docPr id="24" name="Picture 24"/>
             <wp:cNvGraphicFramePr>
               <a:graphicFrameLocks xmlns:a="http://schemas.openxmlformats.org/drawingml/2006/main" noChangeAspect="1"/>
             </wp:cNvGraphicFramePr>
@@ -1060,13 +815,192 @@
               <a:graphicData uri="http://schemas.openxmlformats.org/drawingml/2006/picture">
                 <pic:pic xmlns:pic="http://schemas.openxmlformats.org/drawingml/2006/picture">
                   <pic:nvPicPr>
-                    <pic:cNvPr id="0" name="Picture 10"/>
+                    <pic:cNvPr id="0" name="Picture 8"/>
                     <pic:cNvPicPr>
                       <a:picLocks noChangeAspect="1" noChangeArrowheads="1"/>
                     </pic:cNvPicPr>
                   </pic:nvPicPr>
                   <pic:blipFill>
-                    <a:blip r:embed="rId14">
+                    <a:blip r:embed="rId14" cstate="print">
+                      <a:extLst>
+                        <a:ext uri="{28A0092B-C50C-407E-A947-70E740481C1C}">
+                          <a14:useLocalDpi xmlns:a14="http://schemas.microsoft.com/office/drawing/2010/main" val="0"/>
+                        </a:ext>
+                      </a:extLst>
+                    </a:blip>
+                    <a:srcRect/>
+                    <a:stretch>
+                      <a:fillRect/>
+                    </a:stretch>
+                  </pic:blipFill>
+                  <pic:spPr bwMode="auto">
+                    <a:xfrm>
+                      <a:off x="0" y="0"/>
+                      <a:ext cx="1552575" cy="1428750"/>
+                    </a:xfrm>
+                    <a:prstGeom prst="rect">
+                      <a:avLst/>
+                    </a:prstGeom>
+                    <a:noFill/>
+                    <a:ln>
+                      <a:noFill/>
+                    </a:ln>
+                  </pic:spPr>
+                </pic:pic>
+              </a:graphicData>
+            </a:graphic>
+          </wp:inline>
+        </w:drawing>
+      </w:r>
+    </w:p>
+    <w:p>
+      <w:pPr>
+        <w:shd w:val="clear" w:color="auto" w:fill="FFFFFF"/>
+        <w:spacing w:before="150"/>
+        <w:rPr>
+          <w:rFonts w:ascii="Segoe UI" w:eastAsia="Times New Roman" w:hAnsi="Segoe UI" w:cs="Segoe UI"/>
+          <w:color w:val="172B4D"/>
+          <w:sz w:val="21"/>
+          <w:szCs w:val="21"/>
+        </w:rPr>
+      </w:pPr>
+      <w:r>
+        <w:rPr>
+          <w:rFonts w:ascii="Segoe UI" w:eastAsia="Times New Roman" w:hAnsi="Segoe UI" w:cs="Segoe UI"/>
+          <w:i/>
+          <w:iCs/>
+          <w:color w:val="172B4D"/>
+          <w:sz w:val="21"/>
+          <w:szCs w:val="21"/>
+        </w:rPr>
+        <w:t xml:space="preserve">Associations with a Pt threshold set at ~1 </w:t>
+      </w:r>
+      <w:proofErr w:type="spellStart"/>
+      <w:r>
+        <w:rPr>
+          <w:rFonts w:ascii="Segoe UI" w:eastAsia="Times New Roman" w:hAnsi="Segoe UI" w:cs="Segoe UI"/>
+          <w:i/>
+          <w:iCs/>
+          <w:color w:val="172B4D"/>
+          <w:sz w:val="21"/>
+          <w:szCs w:val="21"/>
+        </w:rPr>
+        <w:t>wt</w:t>
+      </w:r>
+      <w:proofErr w:type="spellEnd"/>
+      <w:r>
+        <w:rPr>
+          <w:rFonts w:ascii="Segoe UI" w:eastAsia="Times New Roman" w:hAnsi="Segoe UI" w:cs="Segoe UI"/>
+          <w:i/>
+          <w:iCs/>
+          <w:color w:val="172B4D"/>
+          <w:sz w:val="21"/>
+          <w:szCs w:val="21"/>
+        </w:rPr>
+        <w:t>% apparent (left) and Pt-Bi Association showing trends of contrasting Pt/Bi (centre), Image Region window after Pt threshold, Fe showing selected pixels (right)</w:t>
+      </w:r>
+    </w:p>
+    <w:p>
+      <w:pPr>
+        <w:shd w:val="clear" w:color="auto" w:fill="FFFFFF"/>
+        <w:spacing w:before="150"/>
+        <w:rPr>
+          <w:rFonts w:ascii="Segoe UI" w:eastAsia="Times New Roman" w:hAnsi="Segoe UI" w:cs="Segoe UI"/>
+          <w:color w:val="172B4D"/>
+          <w:sz w:val="21"/>
+          <w:szCs w:val="21"/>
+        </w:rPr>
+      </w:pPr>
+      <w:r>
+        <w:rPr>
+          <w:rFonts w:ascii="Segoe UI" w:eastAsia="Times New Roman" w:hAnsi="Segoe UI" w:cs="Segoe UI"/>
+          <w:color w:val="172B4D"/>
+          <w:sz w:val="21"/>
+          <w:szCs w:val="21"/>
+        </w:rPr>
+        <w:t>The hotspots in this pixel selection can be separated into individual regions, one for each particle or hotspot, using a watershed analysis. Click on the "Hotspots" tab in the </w:t>
+      </w:r>
+      <w:r>
+        <w:rPr>
+          <w:rFonts w:ascii="Segoe UI" w:eastAsia="Times New Roman" w:hAnsi="Segoe UI" w:cs="Segoe UI"/>
+          <w:i/>
+          <w:iCs/>
+          <w:color w:val="172B4D"/>
+          <w:sz w:val="21"/>
+          <w:szCs w:val="21"/>
+        </w:rPr>
+        <w:t>Image Regions</w:t>
+      </w:r>
+      <w:r>
+        <w:rPr>
+          <w:rFonts w:ascii="Segoe UI" w:eastAsia="Times New Roman" w:hAnsi="Segoe UI" w:cs="Segoe UI"/>
+          <w:color w:val="172B4D"/>
+          <w:sz w:val="21"/>
+          <w:szCs w:val="21"/>
+        </w:rPr>
+        <w:t> window to view hotspot operations and enter "Pt" in the text box to use the XY centroids determined from the Pt analyses. Click "Hotspot separation" to calculate these (another popup will warn of the total number found; note that numbers larger than 1000 will take some time).</w:t>
+      </w:r>
+    </w:p>
+    <w:p>
+      <w:pPr>
+        <w:shd w:val="clear" w:color="auto" w:fill="FFFFFF"/>
+        <w:spacing w:before="150"/>
+        <w:rPr>
+          <w:rFonts w:ascii="Segoe UI" w:eastAsia="Times New Roman" w:hAnsi="Segoe UI" w:cs="Segoe UI"/>
+          <w:color w:val="172B4D"/>
+          <w:sz w:val="21"/>
+          <w:szCs w:val="21"/>
+        </w:rPr>
+      </w:pPr>
+      <w:r>
+        <w:rPr>
+          <w:rFonts w:ascii="Segoe UI" w:eastAsia="Times New Roman" w:hAnsi="Segoe UI" w:cs="Segoe UI"/>
+          <w:color w:val="172B4D"/>
+          <w:sz w:val="21"/>
+          <w:szCs w:val="21"/>
+        </w:rPr>
+        <w:t>The first region #0 remains as before, with all hotspots selected. Regions #1 and above are the separated hotspot regions. Remember to save the regions found to a file. The hotspot operation will suggest a suitable file-name.</w:t>
+      </w:r>
+    </w:p>
+    <w:p>
+      <w:pPr>
+        <w:shd w:val="clear" w:color="auto" w:fill="FFFFFF"/>
+        <w:spacing w:before="150"/>
+        <w:rPr>
+          <w:rFonts w:ascii="Segoe UI" w:eastAsia="Times New Roman" w:hAnsi="Segoe UI" w:cs="Segoe UI"/>
+          <w:color w:val="172B4D"/>
+          <w:sz w:val="21"/>
+          <w:szCs w:val="21"/>
+        </w:rPr>
+      </w:pPr>
+      <w:r>
+        <w:rPr>
+          <w:rFonts w:ascii="Segoe UI" w:eastAsia="Times New Roman" w:hAnsi="Segoe UI" w:cs="Segoe UI"/>
+          <w:noProof/>
+          <w:color w:val="172B4D"/>
+          <w:sz w:val="21"/>
+          <w:szCs w:val="21"/>
+        </w:rPr>
+        <w:lastRenderedPageBreak/>
+        <w:drawing>
+          <wp:inline distT="0" distB="0" distL="0" distR="0" wp14:anchorId="476B5EAA" wp14:editId="2950A4CB">
+            <wp:extent cx="3114675" cy="1428750"/>
+            <wp:effectExtent l="0" t="0" r="0" b="0"/>
+            <wp:docPr id="23" name="Picture 23"/>
+            <wp:cNvGraphicFramePr>
+              <a:graphicFrameLocks xmlns:a="http://schemas.openxmlformats.org/drawingml/2006/main" noChangeAspect="1"/>
+            </wp:cNvGraphicFramePr>
+            <a:graphic xmlns:a="http://schemas.openxmlformats.org/drawingml/2006/main">
+              <a:graphicData uri="http://schemas.openxmlformats.org/drawingml/2006/picture">
+                <pic:pic xmlns:pic="http://schemas.openxmlformats.org/drawingml/2006/picture">
+                  <pic:nvPicPr>
+                    <pic:cNvPr id="0" name="Picture 9"/>
+                    <pic:cNvPicPr>
+                      <a:picLocks noChangeAspect="1" noChangeArrowheads="1"/>
+                    </pic:cNvPicPr>
+                  </pic:nvPicPr>
+                  <pic:blipFill>
+                    <a:blip r:embed="rId15">
                       <a:extLst>
                         <a:ext uri="{28A0092B-C50C-407E-A947-70E740481C1C}">
                           <a14:useLocalDpi xmlns:a14="http://schemas.microsoft.com/office/drawing/2010/main" val="0"/>
@@ -1097,6 +1031,72 @@
           </wp:inline>
         </w:drawing>
       </w:r>
+      <w:r>
+        <w:rPr>
+          <w:rFonts w:ascii="Segoe UI" w:eastAsia="Times New Roman" w:hAnsi="Segoe UI" w:cs="Segoe UI"/>
+          <w:color w:val="172B4D"/>
+          <w:sz w:val="21"/>
+          <w:szCs w:val="21"/>
+        </w:rPr>
+        <w:t> </w:t>
+      </w:r>
+      <w:r>
+        <w:rPr>
+          <w:rFonts w:ascii="Segoe UI" w:eastAsia="Times New Roman" w:hAnsi="Segoe UI" w:cs="Segoe UI"/>
+          <w:noProof/>
+          <w:color w:val="172B4D"/>
+          <w:sz w:val="21"/>
+          <w:szCs w:val="21"/>
+        </w:rPr>
+        <w:drawing>
+          <wp:inline distT="0" distB="0" distL="0" distR="0" wp14:anchorId="7D1B879B" wp14:editId="231F47D4">
+            <wp:extent cx="3114675" cy="1428750"/>
+            <wp:effectExtent l="0" t="0" r="0" b="0"/>
+            <wp:docPr id="22" name="Picture 22"/>
+            <wp:cNvGraphicFramePr>
+              <a:graphicFrameLocks xmlns:a="http://schemas.openxmlformats.org/drawingml/2006/main" noChangeAspect="1"/>
+            </wp:cNvGraphicFramePr>
+            <a:graphic xmlns:a="http://schemas.openxmlformats.org/drawingml/2006/main">
+              <a:graphicData uri="http://schemas.openxmlformats.org/drawingml/2006/picture">
+                <pic:pic xmlns:pic="http://schemas.openxmlformats.org/drawingml/2006/picture">
+                  <pic:nvPicPr>
+                    <pic:cNvPr id="0" name="Picture 10"/>
+                    <pic:cNvPicPr>
+                      <a:picLocks noChangeAspect="1" noChangeArrowheads="1"/>
+                    </pic:cNvPicPr>
+                  </pic:nvPicPr>
+                  <pic:blipFill>
+                    <a:blip r:embed="rId16">
+                      <a:extLst>
+                        <a:ext uri="{28A0092B-C50C-407E-A947-70E740481C1C}">
+                          <a14:useLocalDpi xmlns:a14="http://schemas.microsoft.com/office/drawing/2010/main" val="0"/>
+                        </a:ext>
+                      </a:extLst>
+                    </a:blip>
+                    <a:srcRect/>
+                    <a:stretch>
+                      <a:fillRect/>
+                    </a:stretch>
+                  </pic:blipFill>
+                  <pic:spPr bwMode="auto">
+                    <a:xfrm>
+                      <a:off x="0" y="0"/>
+                      <a:ext cx="3114675" cy="1428750"/>
+                    </a:xfrm>
+                    <a:prstGeom prst="rect">
+                      <a:avLst/>
+                    </a:prstGeom>
+                    <a:noFill/>
+                    <a:ln>
+                      <a:noFill/>
+                    </a:ln>
+                  </pic:spPr>
+                </pic:pic>
+              </a:graphicData>
+            </a:graphic>
+          </wp:inline>
+        </w:drawing>
+      </w:r>
     </w:p>
     <w:p>
       <w:pPr>
@@ -1248,7 +1248,7 @@
                     </pic:cNvPicPr>
                   </pic:nvPicPr>
                   <pic:blipFill>
-                    <a:blip r:embed="rId15">
+                    <a:blip r:embed="rId17">
                       <a:extLst>
                         <a:ext uri="{28A0092B-C50C-407E-A947-70E740481C1C}">
                           <a14:useLocalDpi xmlns:a14="http://schemas.microsoft.com/office/drawing/2010/main" val="0"/>
@@ -1314,7 +1314,7 @@
                     </pic:cNvPicPr>
                   </pic:nvPicPr>
                   <pic:blipFill>
-                    <a:blip r:embed="rId16">
+                    <a:blip r:embed="rId18">
                       <a:extLst>
                         <a:ext uri="{28A0092B-C50C-407E-A947-70E740481C1C}">
                           <a14:useLocalDpi xmlns:a14="http://schemas.microsoft.com/office/drawing/2010/main" val="0"/>
@@ -1405,7 +1405,7 @@
                     </pic:cNvPicPr>
                   </pic:nvPicPr>
                   <pic:blipFill>
-                    <a:blip r:embed="rId17">
+                    <a:blip r:embed="rId19">
                       <a:extLst>
                         <a:ext uri="{28A0092B-C50C-407E-A947-70E740481C1C}">
                           <a14:useLocalDpi xmlns:a14="http://schemas.microsoft.com/office/drawing/2010/main" val="0"/>
@@ -1475,7 +1475,27 @@
           <w:sz w:val="21"/>
           <w:szCs w:val="21"/>
         </w:rPr>
-        <w:t xml:space="preserve"> points (not really there in this sample), then you could apply a second field on Au-As and use the menu “</w:t>
+        <w:t xml:space="preserve"> points (not </w:t>
+      </w:r>
+      <w:proofErr w:type="gramStart"/>
+      <w:r>
+        <w:rPr>
+          <w:rFonts w:ascii="Segoe UI" w:eastAsia="Times New Roman" w:hAnsi="Segoe UI" w:cs="Segoe UI"/>
+          <w:color w:val="172B4D"/>
+          <w:sz w:val="21"/>
+          <w:szCs w:val="21"/>
+        </w:rPr>
+        <w:t>really there</w:t>
+      </w:r>
+      <w:proofErr w:type="gramEnd"/>
+      <w:r>
+        <w:rPr>
+          <w:rFonts w:ascii="Segoe UI" w:eastAsia="Times New Roman" w:hAnsi="Segoe UI" w:cs="Segoe UI"/>
+          <w:color w:val="172B4D"/>
+          <w:sz w:val="21"/>
+          <w:szCs w:val="21"/>
+        </w:rPr>
+        <w:t xml:space="preserve"> in this sample), then you could apply a second field on Au-As and use the menu “</w:t>
       </w:r>
       <w:r>
         <w:rPr>
@@ -1535,7 +1555,7 @@
                     </pic:cNvPicPr>
                   </pic:nvPicPr>
                   <pic:blipFill>
-                    <a:blip r:embed="rId18">
+                    <a:blip r:embed="rId20">
                       <a:extLst>
                         <a:ext uri="{28A0092B-C50C-407E-A947-70E740481C1C}">
                           <a14:useLocalDpi xmlns:a14="http://schemas.microsoft.com/office/drawing/2010/main" val="0"/>
@@ -1734,7 +1754,7 @@
                     </pic:cNvPicPr>
                   </pic:nvPicPr>
                   <pic:blipFill>
-                    <a:blip r:embed="rId19">
+                    <a:blip r:embed="rId21">
                       <a:extLst>
                         <a:ext uri="{28A0092B-C50C-407E-A947-70E740481C1C}">
                           <a14:useLocalDpi xmlns:a14="http://schemas.microsoft.com/office/drawing/2010/main" val="0"/>
@@ -1800,7 +1820,7 @@
                     </pic:cNvPicPr>
                   </pic:nvPicPr>
                   <pic:blipFill>
-                    <a:blip r:embed="rId20">
+                    <a:blip r:embed="rId22">
                       <a:extLst>
                         <a:ext uri="{28A0092B-C50C-407E-A947-70E740481C1C}">
                           <a14:useLocalDpi xmlns:a14="http://schemas.microsoft.com/office/drawing/2010/main" val="0"/>
@@ -2282,7 +2302,7 @@
                     </pic:cNvPicPr>
                   </pic:nvPicPr>
                   <pic:blipFill>
-                    <a:blip r:embed="rId21" cstate="print">
+                    <a:blip r:embed="rId23" cstate="print">
                       <a:extLst>
                         <a:ext uri="{28A0092B-C50C-407E-A947-70E740481C1C}">
                           <a14:useLocalDpi xmlns:a14="http://schemas.microsoft.com/office/drawing/2010/main" val="0"/>
@@ -2348,7 +2368,7 @@
                     </pic:cNvPicPr>
                   </pic:nvPicPr>
                   <pic:blipFill>
-                    <a:blip r:embed="rId22">
+                    <a:blip r:embed="rId24">
                       <a:extLst>
                         <a:ext uri="{28A0092B-C50C-407E-A947-70E740481C1C}">
                           <a14:useLocalDpi xmlns:a14="http://schemas.microsoft.com/office/drawing/2010/main" val="0"/>
@@ -2440,7 +2460,7 @@
                     </pic:cNvPicPr>
                   </pic:nvPicPr>
                   <pic:blipFill>
-                    <a:blip r:embed="rId23" cstate="print">
+                    <a:blip r:embed="rId25" cstate="print">
                       <a:extLst>
                         <a:ext uri="{28A0092B-C50C-407E-A947-70E740481C1C}">
                           <a14:useLocalDpi xmlns:a14="http://schemas.microsoft.com/office/drawing/2010/main" val="0"/>
@@ -2506,7 +2526,7 @@
                     </pic:cNvPicPr>
                   </pic:nvPicPr>
                   <pic:blipFill>
-                    <a:blip r:embed="rId24">
+                    <a:blip r:embed="rId26">
                       <a:extLst>
                         <a:ext uri="{28A0092B-C50C-407E-A947-70E740481C1C}">
                           <a14:useLocalDpi xmlns:a14="http://schemas.microsoft.com/office/drawing/2010/main" val="0"/>
@@ -2662,7 +2682,7 @@
                     </pic:cNvPicPr>
                   </pic:nvPicPr>
                   <pic:blipFill>
-                    <a:blip r:embed="rId25" cstate="print">
+                    <a:blip r:embed="rId27" cstate="print">
                       <a:extLst>
                         <a:ext uri="{28A0092B-C50C-407E-A947-70E740481C1C}">
                           <a14:useLocalDpi xmlns:a14="http://schemas.microsoft.com/office/drawing/2010/main" val="0"/>
@@ -2763,27 +2783,7 @@
           <w:sz w:val="21"/>
           <w:szCs w:val="21"/>
         </w:rPr>
-        <w:t xml:space="preserve">The default colour scheme for single element maps can be changed to suit your needs. The linear colour scales such as "B-W Linear" and "Blue/White" can be used to ensure the maps are </w:t>
-      </w:r>
-      <w:proofErr w:type="spellStart"/>
-      <w:r>
-        <w:rPr>
-          <w:rFonts w:ascii="Segoe UI" w:eastAsia="Times New Roman" w:hAnsi="Segoe UI" w:cs="Segoe UI"/>
-          <w:color w:val="172B4D"/>
-          <w:sz w:val="21"/>
-          <w:szCs w:val="21"/>
-        </w:rPr>
-        <w:t>colourblind</w:t>
-      </w:r>
-      <w:proofErr w:type="spellEnd"/>
-      <w:r>
-        <w:rPr>
-          <w:rFonts w:ascii="Segoe UI" w:eastAsia="Times New Roman" w:hAnsi="Segoe UI" w:cs="Segoe UI"/>
-          <w:color w:val="172B4D"/>
-          <w:sz w:val="21"/>
-          <w:szCs w:val="21"/>
-        </w:rPr>
-        <w:t xml:space="preserve"> friendly.</w:t>
+        <w:t>The default colour scheme for single element maps can be changed to suit your needs. The linear colour scales such as "B-W Linear" and "Blue/White" can be used to ensure the maps are colourblind friendly.</w:t>
       </w:r>
     </w:p>
     <w:p>
@@ -2970,7 +2970,7 @@
                     </pic:cNvPicPr>
                   </pic:nvPicPr>
                   <pic:blipFill>
-                    <a:blip r:embed="rId26">
+                    <a:blip r:embed="rId28">
                       <a:extLst>
                         <a:ext uri="{28A0092B-C50C-407E-A947-70E740481C1C}">
                           <a14:useLocalDpi xmlns:a14="http://schemas.microsoft.com/office/drawing/2010/main" val="0"/>
@@ -3185,7 +3185,7 @@
                     </pic:cNvPicPr>
                   </pic:nvPicPr>
                   <pic:blipFill>
-                    <a:blip r:embed="rId27">
+                    <a:blip r:embed="rId29">
                       <a:extLst>
                         <a:ext uri="{28A0092B-C50C-407E-A947-70E740481C1C}">
                           <a14:useLocalDpi xmlns:a14="http://schemas.microsoft.com/office/drawing/2010/main" val="0"/>
@@ -3251,7 +3251,7 @@
                     </pic:cNvPicPr>
                   </pic:nvPicPr>
                   <pic:blipFill>
-                    <a:blip r:embed="rId28">
+                    <a:blip r:embed="rId30">
                       <a:extLst>
                         <a:ext uri="{28A0092B-C50C-407E-A947-70E740481C1C}">
                           <a14:useLocalDpi xmlns:a14="http://schemas.microsoft.com/office/drawing/2010/main" val="0"/>
@@ -3428,7 +3428,7 @@
                     </pic:cNvPicPr>
                   </pic:nvPicPr>
                   <pic:blipFill>
-                    <a:blip r:embed="rId29">
+                    <a:blip r:embed="rId31">
                       <a:extLst>
                         <a:ext uri="{28A0092B-C50C-407E-A947-70E740481C1C}">
                           <a14:useLocalDpi xmlns:a14="http://schemas.microsoft.com/office/drawing/2010/main" val="0"/>
@@ -3494,7 +3494,7 @@
                     </pic:cNvPicPr>
                   </pic:nvPicPr>
                   <pic:blipFill>
-                    <a:blip r:embed="rId30" cstate="print">
+                    <a:blip r:embed="rId32" cstate="print">
                       <a:extLst>
                         <a:ext uri="{28A0092B-C50C-407E-A947-70E740481C1C}">
                           <a14:useLocalDpi xmlns:a14="http://schemas.microsoft.com/office/drawing/2010/main" val="0"/>
@@ -3649,7 +3649,7 @@
                     </pic:cNvPicPr>
                   </pic:nvPicPr>
                   <pic:blipFill>
-                    <a:blip r:embed="rId31">
+                    <a:blip r:embed="rId33">
                       <a:extLst>
                         <a:ext uri="{28A0092B-C50C-407E-A947-70E740481C1C}">
                           <a14:useLocalDpi xmlns:a14="http://schemas.microsoft.com/office/drawing/2010/main" val="0"/>
@@ -3715,7 +3715,7 @@
                     </pic:cNvPicPr>
                   </pic:nvPicPr>
                   <pic:blipFill>
-                    <a:blip r:embed="rId32">
+                    <a:blip r:embed="rId34">
                       <a:extLst>
                         <a:ext uri="{28A0092B-C50C-407E-A947-70E740481C1C}">
                           <a14:useLocalDpi xmlns:a14="http://schemas.microsoft.com/office/drawing/2010/main" val="0"/>
@@ -3876,7 +3876,7 @@
                     </pic:cNvPicPr>
                   </pic:nvPicPr>
                   <pic:blipFill>
-                    <a:blip r:embed="rId33">
+                    <a:blip r:embed="rId35">
                       <a:extLst>
                         <a:ext uri="{28A0092B-C50C-407E-A947-70E740481C1C}">
                           <a14:useLocalDpi xmlns:a14="http://schemas.microsoft.com/office/drawing/2010/main" val="0"/>
@@ -3942,7 +3942,7 @@
                     </pic:cNvPicPr>
                   </pic:nvPicPr>
                   <pic:blipFill>
-                    <a:blip r:embed="rId34">
+                    <a:blip r:embed="rId36">
                       <a:extLst>
                         <a:ext uri="{28A0092B-C50C-407E-A947-70E740481C1C}">
                           <a14:useLocalDpi xmlns:a14="http://schemas.microsoft.com/office/drawing/2010/main" val="0"/>
@@ -4008,7 +4008,7 @@
                     </pic:cNvPicPr>
                   </pic:nvPicPr>
                   <pic:blipFill>
-                    <a:blip r:embed="rId31">
+                    <a:blip r:embed="rId33">
                       <a:extLst>
                         <a:ext uri="{28A0092B-C50C-407E-A947-70E740481C1C}">
                           <a14:useLocalDpi xmlns:a14="http://schemas.microsoft.com/office/drawing/2010/main" val="0"/>
@@ -7664,11 +7664,14 @@
         <w:t>All element results are shown as ppm apparent (for the model composition and typically 30 µm pixel size)</w:t>
       </w:r>
     </w:p>
-    <w:p>
-      <w:bookmarkStart w:id="0" w:name="_GoBack"/>
-      <w:bookmarkEnd w:id="0"/>
-    </w:p>
+    <w:p/>
     <w:sectPr>
+      <w:headerReference w:type="even" r:id="rId37"/>
+      <w:headerReference w:type="default" r:id="rId38"/>
+      <w:footerReference w:type="even" r:id="rId39"/>
+      <w:footerReference w:type="default" r:id="rId40"/>
+      <w:headerReference w:type="first" r:id="rId41"/>
+      <w:footerReference w:type="first" r:id="rId42"/>
       <w:pgSz w:w="11906" w:h="16838"/>
       <w:pgMar w:top="1440" w:right="1080" w:bottom="1440" w:left="1080" w:header="708" w:footer="708" w:gutter="0"/>
       <w:cols w:space="708"/>
@@ -7678,8 +7681,820 @@
 </w:document>
 </file>
 
+<file path=word/endnotes.xml><?xml version="1.0" encoding="utf-8"?>
+<w:endnotes xmlns:wpc="http://schemas.microsoft.com/office/word/2010/wordprocessingCanvas" xmlns:cx="http://schemas.microsoft.com/office/drawing/2014/chartex" xmlns:cx1="http://schemas.microsoft.com/office/drawing/2015/9/8/chartex" xmlns:cx2="http://schemas.microsoft.com/office/drawing/2015/10/21/chartex" xmlns:cx3="http://schemas.microsoft.com/office/drawing/2016/5/9/chartex" xmlns:cx4="http://schemas.microsoft.com/office/drawing/2016/5/10/chartex" xmlns:cx5="http://schemas.microsoft.com/office/drawing/2016/5/11/chartex" xmlns:cx6="http://schemas.microsoft.com/office/drawing/2016/5/12/chartex" xmlns:cx7="http://schemas.microsoft.com/office/drawing/2016/5/13/chartex" xmlns:cx8="http://schemas.microsoft.com/office/drawing/2016/5/14/chartex" xmlns:mc="http://schemas.openxmlformats.org/markup-compatibility/2006" xmlns:aink="http://schemas.microsoft.com/office/drawing/2016/ink" xmlns:am3d="http://schemas.microsoft.com/office/drawing/2017/model3d" xmlns:o="urn:schemas-microsoft-com:office:office" xmlns:oel="http://schemas.microsoft.com/office/2019/extlst" xmlns:r="http://schemas.openxmlformats.org/officeDocument/2006/relationships" xmlns:m="http://schemas.openxmlformats.org/officeDocument/2006/math" xmlns:v="urn:schemas-microsoft-com:vml" xmlns:wp14="http://schemas.microsoft.com/office/word/2010/wordprocessingDrawing" xmlns:wp="http://schemas.openxmlformats.org/drawingml/2006/wordprocessingDrawing" xmlns:w10="urn:schemas-microsoft-com:office:word" xmlns:w="http://schemas.openxmlformats.org/wordprocessingml/2006/main" xmlns:w14="http://schemas.microsoft.com/office/word/2010/wordml" xmlns:w15="http://schemas.microsoft.com/office/word/2012/wordml" xmlns:w16cex="http://schemas.microsoft.com/office/word/2018/wordml/cex" xmlns:w16cid="http://schemas.microsoft.com/office/word/2016/wordml/cid" xmlns:w16="http://schemas.microsoft.com/office/word/2018/wordml" xmlns:w16du="http://schemas.microsoft.com/office/word/2023/wordml/word16du" xmlns:w16sdtdh="http://schemas.microsoft.com/office/word/2020/wordml/sdtdatahash" xmlns:w16sdtfl="http://schemas.microsoft.com/office/word/2024/wordml/sdtformatlock" xmlns:w16se="http://schemas.microsoft.com/office/word/2015/wordml/symex" xmlns:wpg="http://schemas.microsoft.com/office/word/2010/wordprocessingGroup" xmlns:wpi="http://schemas.microsoft.com/office/word/2010/wordprocessingInk" xmlns:wne="http://schemas.microsoft.com/office/word/2006/wordml" xmlns:wps="http://schemas.microsoft.com/office/word/2010/wordprocessingShape" mc:Ignorable="w14 w15 w16se w16cid w16 w16cex w16sdtdh w16sdtfl w16du wp14">
+  <w:endnote w:type="separator" w:id="-1">
+    <w:p>
+      <w:r>
+        <w:separator/>
+      </w:r>
+    </w:p>
+  </w:endnote>
+  <w:endnote w:type="continuationSeparator" w:id="0">
+    <w:p>
+      <w:r>
+        <w:continuationSeparator/>
+      </w:r>
+    </w:p>
+  </w:endnote>
+</w:endnotes>
+</file>
+
+<file path=word/footer1.xml><?xml version="1.0" encoding="utf-8"?>
+<w:ftr xmlns:wpc="http://schemas.microsoft.com/office/word/2010/wordprocessingCanvas" xmlns:cx="http://schemas.microsoft.com/office/drawing/2014/chartex" xmlns:cx1="http://schemas.microsoft.com/office/drawing/2015/9/8/chartex" xmlns:cx2="http://schemas.microsoft.com/office/drawing/2015/10/21/chartex" xmlns:cx3="http://schemas.microsoft.com/office/drawing/2016/5/9/chartex" xmlns:cx4="http://schemas.microsoft.com/office/drawing/2016/5/10/chartex" xmlns:cx5="http://schemas.microsoft.com/office/drawing/2016/5/11/chartex" xmlns:cx6="http://schemas.microsoft.com/office/drawing/2016/5/12/chartex" xmlns:cx7="http://schemas.microsoft.com/office/drawing/2016/5/13/chartex" xmlns:cx8="http://schemas.microsoft.com/office/drawing/2016/5/14/chartex" xmlns:mc="http://schemas.openxmlformats.org/markup-compatibility/2006" xmlns:aink="http://schemas.microsoft.com/office/drawing/2016/ink" xmlns:am3d="http://schemas.microsoft.com/office/drawing/2017/model3d" xmlns:o="urn:schemas-microsoft-com:office:office" xmlns:oel="http://schemas.microsoft.com/office/2019/extlst" xmlns:r="http://schemas.openxmlformats.org/officeDocument/2006/relationships" xmlns:m="http://schemas.openxmlformats.org/officeDocument/2006/math" xmlns:v="urn:schemas-microsoft-com:vml" xmlns:wp14="http://schemas.microsoft.com/office/word/2010/wordprocessingDrawing" xmlns:wp="http://schemas.openxmlformats.org/drawingml/2006/wordprocessingDrawing" xmlns:w10="urn:schemas-microsoft-com:office:word" xmlns:w="http://schemas.openxmlformats.org/wordprocessingml/2006/main" xmlns:w14="http://schemas.microsoft.com/office/word/2010/wordml" xmlns:w15="http://schemas.microsoft.com/office/word/2012/wordml" xmlns:w16cex="http://schemas.microsoft.com/office/word/2018/wordml/cex" xmlns:w16cid="http://schemas.microsoft.com/office/word/2016/wordml/cid" xmlns:w16="http://schemas.microsoft.com/office/word/2018/wordml" xmlns:w16du="http://schemas.microsoft.com/office/word/2023/wordml/word16du" xmlns:w16sdtdh="http://schemas.microsoft.com/office/word/2020/wordml/sdtdatahash" xmlns:w16sdtfl="http://schemas.microsoft.com/office/word/2024/wordml/sdtformatlock" xmlns:w16se="http://schemas.microsoft.com/office/word/2015/wordml/symex" xmlns:wpg="http://schemas.microsoft.com/office/word/2010/wordprocessingGroup" xmlns:wpi="http://schemas.microsoft.com/office/word/2010/wordprocessingInk" xmlns:wne="http://schemas.microsoft.com/office/word/2006/wordml" xmlns:wps="http://schemas.microsoft.com/office/word/2010/wordprocessingShape" mc:Ignorable="w14 w15 w16se w16cid w16 w16cex w16sdtdh w16sdtfl w16du wp14">
+  <w:p>
+    <w:pPr>
+      <w:pStyle w:val="Footer"/>
+    </w:pPr>
+    <w:r>
+      <w:rPr>
+        <w:noProof/>
+      </w:rPr>
+      <mc:AlternateContent>
+        <mc:Choice Requires="wps">
+          <w:drawing>
+            <wp:anchor distT="0" distB="0" distL="0" distR="0" simplePos="0" relativeHeight="251662336" behindDoc="0" locked="0" layoutInCell="1" allowOverlap="1" wp14:anchorId="3A015A52" wp14:editId="339A9524">
+              <wp:simplePos x="635" y="635"/>
+              <wp:positionH relativeFrom="page">
+                <wp:align>center</wp:align>
+              </wp:positionH>
+              <wp:positionV relativeFrom="page">
+                <wp:align>bottom</wp:align>
+              </wp:positionV>
+              <wp:extent cx="622300" cy="376555"/>
+              <wp:effectExtent l="0" t="0" r="6350" b="0"/>
+              <wp:wrapNone/>
+              <wp:docPr id="431422599" name="Text Box 5" descr="OFFICIAL">
+                <a:extLst xmlns:a="http://schemas.openxmlformats.org/drawingml/2006/main">
+                  <a:ext uri="{5AE41FA2-C0FF-4470-9BD4-5FADCA87CBE2}">
+                    <aclsh:classification xmlns:aclsh="http://schemas.microsoft.com/office/drawing/2020/classificationShape" classificationOutcomeType="ftr"/>
+                  </a:ext>
+                </a:extLst>
+              </wp:docPr>
+              <wp:cNvGraphicFramePr/>
+              <a:graphic xmlns:a="http://schemas.openxmlformats.org/drawingml/2006/main">
+                <a:graphicData uri="http://schemas.microsoft.com/office/word/2010/wordprocessingShape">
+                  <wps:wsp>
+                    <wps:cNvSpPr txBox="1"/>
+                    <wps:spPr>
+                      <a:xfrm>
+                        <a:off x="0" y="0"/>
+                        <a:ext cx="622300" cy="376555"/>
+                      </a:xfrm>
+                      <a:prstGeom prst="rect">
+                        <a:avLst/>
+                      </a:prstGeom>
+                      <a:noFill/>
+                      <a:ln>
+                        <a:noFill/>
+                      </a:ln>
+                    </wps:spPr>
+                    <wps:txbx>
+                      <w:txbxContent>
+                        <w:p>
+                          <w:pPr>
+                            <w:rPr>
+                              <w:rFonts w:ascii="Aptos" w:eastAsia="Aptos" w:hAnsi="Aptos" w:cs="Aptos"/>
+                              <w:noProof/>
+                              <w:color w:val="FF0000"/>
+                              <w:sz w:val="24"/>
+                              <w:szCs w:val="24"/>
+                            </w:rPr>
+                          </w:pPr>
+                          <w:r>
+                            <w:rPr>
+                              <w:rFonts w:ascii="Aptos" w:eastAsia="Aptos" w:hAnsi="Aptos" w:cs="Aptos"/>
+                              <w:noProof/>
+                              <w:color w:val="FF0000"/>
+                              <w:sz w:val="24"/>
+                              <w:szCs w:val="24"/>
+                            </w:rPr>
+                            <w:t>OFFICIAL</w:t>
+                          </w:r>
+                        </w:p>
+                      </w:txbxContent>
+                    </wps:txbx>
+                    <wps:bodyPr rot="0" spcFirstLastPara="0" vertOverflow="overflow" horzOverflow="overflow" vert="horz" wrap="none" lIns="0" tIns="0" rIns="0" bIns="190500" numCol="1" spcCol="0" rtlCol="0" fromWordArt="0" anchor="b" anchorCtr="0" forceAA="0" compatLnSpc="1">
+                      <a:prstTxWarp prst="textNoShape">
+                        <a:avLst/>
+                      </a:prstTxWarp>
+                      <a:spAutoFit/>
+                    </wps:bodyPr>
+                  </wps:wsp>
+                </a:graphicData>
+              </a:graphic>
+            </wp:anchor>
+          </w:drawing>
+        </mc:Choice>
+        <mc:Fallback>
+          <w:pict>
+            <v:shapetype w14:anchorId="3A015A52" id="_x0000_t202" coordsize="21600,21600" o:spt="202" path="m,l,21600r21600,l21600,xe">
+              <v:stroke joinstyle="miter"/>
+              <v:path gradientshapeok="t" o:connecttype="rect"/>
+            </v:shapetype>
+            <v:shape id="Text Box 5" o:spid="_x0000_s1028" type="#_x0000_t202" alt="OFFICIAL" style="position:absolute;margin-left:0;margin-top:0;width:49pt;height:29.65pt;z-index:251662336;visibility:visible;mso-wrap-style:none;mso-wrap-distance-left:0;mso-wrap-distance-top:0;mso-wrap-distance-right:0;mso-wrap-distance-bottom:0;mso-position-horizontal:center;mso-position-horizontal-relative:page;mso-position-vertical:bottom;mso-position-vertical-relative:page;v-text-anchor:bottom" o:gfxdata="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" filled="f" stroked="f">
+              <v:fill o:detectmouseclick="t"/>
+              <v:textbox style="mso-fit-shape-to-text:t" inset="0,0,0,15pt">
+                <w:txbxContent>
+                  <w:p>
+                    <w:pPr>
+                      <w:rPr>
+                        <w:rFonts w:ascii="Aptos" w:eastAsia="Aptos" w:hAnsi="Aptos" w:cs="Aptos"/>
+                        <w:noProof/>
+                        <w:color w:val="FF0000"/>
+                        <w:sz w:val="24"/>
+                        <w:szCs w:val="24"/>
+                      </w:rPr>
+                    </w:pPr>
+                    <w:r>
+                      <w:rPr>
+                        <w:rFonts w:ascii="Aptos" w:eastAsia="Aptos" w:hAnsi="Aptos" w:cs="Aptos"/>
+                        <w:noProof/>
+                        <w:color w:val="FF0000"/>
+                        <w:sz w:val="24"/>
+                        <w:szCs w:val="24"/>
+                      </w:rPr>
+                      <w:t>OFFICIAL</w:t>
+                    </w:r>
+                  </w:p>
+                </w:txbxContent>
+              </v:textbox>
+              <w10:wrap anchorx="page" anchory="page"/>
+            </v:shape>
+          </w:pict>
+        </mc:Fallback>
+      </mc:AlternateContent>
+    </w:r>
+  </w:p>
+</w:ftr>
+</file>
+
+<file path=word/footer2.xml><?xml version="1.0" encoding="utf-8"?>
+<w:ftr xmlns:wpc="http://schemas.microsoft.com/office/word/2010/wordprocessingCanvas" xmlns:cx="http://schemas.microsoft.com/office/drawing/2014/chartex" xmlns:cx1="http://schemas.microsoft.com/office/drawing/2015/9/8/chartex" xmlns:cx2="http://schemas.microsoft.com/office/drawing/2015/10/21/chartex" xmlns:cx3="http://schemas.microsoft.com/office/drawing/2016/5/9/chartex" xmlns:cx4="http://schemas.microsoft.com/office/drawing/2016/5/10/chartex" xmlns:cx5="http://schemas.microsoft.com/office/drawing/2016/5/11/chartex" xmlns:cx6="http://schemas.microsoft.com/office/drawing/2016/5/12/chartex" xmlns:cx7="http://schemas.microsoft.com/office/drawing/2016/5/13/chartex" xmlns:cx8="http://schemas.microsoft.com/office/drawing/2016/5/14/chartex" xmlns:mc="http://schemas.openxmlformats.org/markup-compatibility/2006" xmlns:aink="http://schemas.microsoft.com/office/drawing/2016/ink" xmlns:am3d="http://schemas.microsoft.com/office/drawing/2017/model3d" xmlns:o="urn:schemas-microsoft-com:office:office" xmlns:oel="http://schemas.microsoft.com/office/2019/extlst" xmlns:r="http://schemas.openxmlformats.org/officeDocument/2006/relationships" xmlns:m="http://schemas.openxmlformats.org/officeDocument/2006/math" xmlns:v="urn:schemas-microsoft-com:vml" xmlns:wp14="http://schemas.microsoft.com/office/word/2010/wordprocessingDrawing" xmlns:wp="http://schemas.openxmlformats.org/drawingml/2006/wordprocessingDrawing" xmlns:w10="urn:schemas-microsoft-com:office:word" xmlns:w="http://schemas.openxmlformats.org/wordprocessingml/2006/main" xmlns:w14="http://schemas.microsoft.com/office/word/2010/wordml" xmlns:w15="http://schemas.microsoft.com/office/word/2012/wordml" xmlns:w16cex="http://schemas.microsoft.com/office/word/2018/wordml/cex" xmlns:w16cid="http://schemas.microsoft.com/office/word/2016/wordml/cid" xmlns:w16="http://schemas.microsoft.com/office/word/2018/wordml" xmlns:w16du="http://schemas.microsoft.com/office/word/2023/wordml/word16du" xmlns:w16sdtdh="http://schemas.microsoft.com/office/word/2020/wordml/sdtdatahash" xmlns:w16sdtfl="http://schemas.microsoft.com/office/word/2024/wordml/sdtformatlock" xmlns:w16se="http://schemas.microsoft.com/office/word/2015/wordml/symex" xmlns:wpg="http://schemas.microsoft.com/office/word/2010/wordprocessingGroup" xmlns:wpi="http://schemas.microsoft.com/office/word/2010/wordprocessingInk" xmlns:wne="http://schemas.microsoft.com/office/word/2006/wordml" xmlns:wps="http://schemas.microsoft.com/office/word/2010/wordprocessingShape" mc:Ignorable="w14 w15 w16se w16cid w16 w16cex w16sdtdh w16sdtfl w16du wp14">
+  <w:p>
+    <w:pPr>
+      <w:pStyle w:val="Footer"/>
+    </w:pPr>
+    <w:r>
+      <w:rPr>
+        <w:noProof/>
+      </w:rPr>
+      <mc:AlternateContent>
+        <mc:Choice Requires="wps">
+          <w:drawing>
+            <wp:anchor distT="0" distB="0" distL="0" distR="0" simplePos="0" relativeHeight="251663360" behindDoc="0" locked="0" layoutInCell="1" allowOverlap="1" wp14:anchorId="0F9EDB5D" wp14:editId="1D41D79D">
+              <wp:simplePos x="690113" y="10064438"/>
+              <wp:positionH relativeFrom="page">
+                <wp:align>center</wp:align>
+              </wp:positionH>
+              <wp:positionV relativeFrom="page">
+                <wp:align>bottom</wp:align>
+              </wp:positionV>
+              <wp:extent cx="622300" cy="376555"/>
+              <wp:effectExtent l="0" t="0" r="6350" b="0"/>
+              <wp:wrapNone/>
+              <wp:docPr id="1593693032" name="Text Box 6" descr="OFFICIAL">
+                <a:extLst xmlns:a="http://schemas.openxmlformats.org/drawingml/2006/main">
+                  <a:ext uri="{5AE41FA2-C0FF-4470-9BD4-5FADCA87CBE2}">
+                    <aclsh:classification xmlns:aclsh="http://schemas.microsoft.com/office/drawing/2020/classificationShape" classificationOutcomeType="ftr"/>
+                  </a:ext>
+                </a:extLst>
+              </wp:docPr>
+              <wp:cNvGraphicFramePr/>
+              <a:graphic xmlns:a="http://schemas.openxmlformats.org/drawingml/2006/main">
+                <a:graphicData uri="http://schemas.microsoft.com/office/word/2010/wordprocessingShape">
+                  <wps:wsp>
+                    <wps:cNvSpPr txBox="1"/>
+                    <wps:spPr>
+                      <a:xfrm>
+                        <a:off x="0" y="0"/>
+                        <a:ext cx="622300" cy="376555"/>
+                      </a:xfrm>
+                      <a:prstGeom prst="rect">
+                        <a:avLst/>
+                      </a:prstGeom>
+                      <a:noFill/>
+                      <a:ln>
+                        <a:noFill/>
+                      </a:ln>
+                    </wps:spPr>
+                    <wps:txbx>
+                      <w:txbxContent>
+                        <w:p>
+                          <w:pPr>
+                            <w:rPr>
+                              <w:rFonts w:ascii="Aptos" w:eastAsia="Aptos" w:hAnsi="Aptos" w:cs="Aptos"/>
+                              <w:noProof/>
+                              <w:color w:val="FF0000"/>
+                              <w:sz w:val="24"/>
+                              <w:szCs w:val="24"/>
+                            </w:rPr>
+                          </w:pPr>
+                          <w:r>
+                            <w:rPr>
+                              <w:rFonts w:ascii="Aptos" w:eastAsia="Aptos" w:hAnsi="Aptos" w:cs="Aptos"/>
+                              <w:noProof/>
+                              <w:color w:val="FF0000"/>
+                              <w:sz w:val="24"/>
+                              <w:szCs w:val="24"/>
+                            </w:rPr>
+                            <w:t>OFFICIAL</w:t>
+                          </w:r>
+                        </w:p>
+                      </w:txbxContent>
+                    </wps:txbx>
+                    <wps:bodyPr rot="0" spcFirstLastPara="0" vertOverflow="overflow" horzOverflow="overflow" vert="horz" wrap="none" lIns="0" tIns="0" rIns="0" bIns="190500" numCol="1" spcCol="0" rtlCol="0" fromWordArt="0" anchor="b" anchorCtr="0" forceAA="0" compatLnSpc="1">
+                      <a:prstTxWarp prst="textNoShape">
+                        <a:avLst/>
+                      </a:prstTxWarp>
+                      <a:spAutoFit/>
+                    </wps:bodyPr>
+                  </wps:wsp>
+                </a:graphicData>
+              </a:graphic>
+            </wp:anchor>
+          </w:drawing>
+        </mc:Choice>
+        <mc:Fallback>
+          <w:pict>
+            <v:shapetype w14:anchorId="0F9EDB5D" id="_x0000_t202" coordsize="21600,21600" o:spt="202" path="m,l,21600r21600,l21600,xe">
+              <v:stroke joinstyle="miter"/>
+              <v:path gradientshapeok="t" o:connecttype="rect"/>
+            </v:shapetype>
+            <v:shape id="Text Box 6" o:spid="_x0000_s1029" type="#_x0000_t202" alt="OFFICIAL" style="position:absolute;margin-left:0;margin-top:0;width:49pt;height:29.65pt;z-index:251663360;visibility:visible;mso-wrap-style:none;mso-wrap-distance-left:0;mso-wrap-distance-top:0;mso-wrap-distance-right:0;mso-wrap-distance-bottom:0;mso-position-horizontal:center;mso-position-horizontal-relative:page;mso-position-vertical:bottom;mso-position-vertical-relative:page;v-text-anchor:bottom" o:gfxdata="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" filled="f" stroked="f">
+              <v:fill o:detectmouseclick="t"/>
+              <v:textbox style="mso-fit-shape-to-text:t" inset="0,0,0,15pt">
+                <w:txbxContent>
+                  <w:p>
+                    <w:pPr>
+                      <w:rPr>
+                        <w:rFonts w:ascii="Aptos" w:eastAsia="Aptos" w:hAnsi="Aptos" w:cs="Aptos"/>
+                        <w:noProof/>
+                        <w:color w:val="FF0000"/>
+                        <w:sz w:val="24"/>
+                        <w:szCs w:val="24"/>
+                      </w:rPr>
+                    </w:pPr>
+                    <w:r>
+                      <w:rPr>
+                        <w:rFonts w:ascii="Aptos" w:eastAsia="Aptos" w:hAnsi="Aptos" w:cs="Aptos"/>
+                        <w:noProof/>
+                        <w:color w:val="FF0000"/>
+                        <w:sz w:val="24"/>
+                        <w:szCs w:val="24"/>
+                      </w:rPr>
+                      <w:t>OFFICIAL</w:t>
+                    </w:r>
+                  </w:p>
+                </w:txbxContent>
+              </v:textbox>
+              <w10:wrap anchorx="page" anchory="page"/>
+            </v:shape>
+          </w:pict>
+        </mc:Fallback>
+      </mc:AlternateContent>
+    </w:r>
+  </w:p>
+</w:ftr>
+</file>
+
+<file path=word/footer3.xml><?xml version="1.0" encoding="utf-8"?>
+<w:ftr xmlns:wpc="http://schemas.microsoft.com/office/word/2010/wordprocessingCanvas" xmlns:cx="http://schemas.microsoft.com/office/drawing/2014/chartex" xmlns:cx1="http://schemas.microsoft.com/office/drawing/2015/9/8/chartex" xmlns:cx2="http://schemas.microsoft.com/office/drawing/2015/10/21/chartex" xmlns:cx3="http://schemas.microsoft.com/office/drawing/2016/5/9/chartex" xmlns:cx4="http://schemas.microsoft.com/office/drawing/2016/5/10/chartex" xmlns:cx5="http://schemas.microsoft.com/office/drawing/2016/5/11/chartex" xmlns:cx6="http://schemas.microsoft.com/office/drawing/2016/5/12/chartex" xmlns:cx7="http://schemas.microsoft.com/office/drawing/2016/5/13/chartex" xmlns:cx8="http://schemas.microsoft.com/office/drawing/2016/5/14/chartex" xmlns:mc="http://schemas.openxmlformats.org/markup-compatibility/2006" xmlns:aink="http://schemas.microsoft.com/office/drawing/2016/ink" xmlns:am3d="http://schemas.microsoft.com/office/drawing/2017/model3d" xmlns:o="urn:schemas-microsoft-com:office:office" xmlns:oel="http://schemas.microsoft.com/office/2019/extlst" xmlns:r="http://schemas.openxmlformats.org/officeDocument/2006/relationships" xmlns:m="http://schemas.openxmlformats.org/officeDocument/2006/math" xmlns:v="urn:schemas-microsoft-com:vml" xmlns:wp14="http://schemas.microsoft.com/office/word/2010/wordprocessingDrawing" xmlns:wp="http://schemas.openxmlformats.org/drawingml/2006/wordprocessingDrawing" xmlns:w10="urn:schemas-microsoft-com:office:word" xmlns:w="http://schemas.openxmlformats.org/wordprocessingml/2006/main" xmlns:w14="http://schemas.microsoft.com/office/word/2010/wordml" xmlns:w15="http://schemas.microsoft.com/office/word/2012/wordml" xmlns:w16cex="http://schemas.microsoft.com/office/word/2018/wordml/cex" xmlns:w16cid="http://schemas.microsoft.com/office/word/2016/wordml/cid" xmlns:w16="http://schemas.microsoft.com/office/word/2018/wordml" xmlns:w16du="http://schemas.microsoft.com/office/word/2023/wordml/word16du" xmlns:w16sdtdh="http://schemas.microsoft.com/office/word/2020/wordml/sdtdatahash" xmlns:w16sdtfl="http://schemas.microsoft.com/office/word/2024/wordml/sdtformatlock" xmlns:w16se="http://schemas.microsoft.com/office/word/2015/wordml/symex" xmlns:wpg="http://schemas.microsoft.com/office/word/2010/wordprocessingGroup" xmlns:wpi="http://schemas.microsoft.com/office/word/2010/wordprocessingInk" xmlns:wne="http://schemas.microsoft.com/office/word/2006/wordml" xmlns:wps="http://schemas.microsoft.com/office/word/2010/wordprocessingShape" mc:Ignorable="w14 w15 w16se w16cid w16 w16cex w16sdtdh w16sdtfl w16du wp14">
+  <w:p>
+    <w:pPr>
+      <w:pStyle w:val="Footer"/>
+    </w:pPr>
+    <w:r>
+      <w:rPr>
+        <w:noProof/>
+      </w:rPr>
+      <mc:AlternateContent>
+        <mc:Choice Requires="wps">
+          <w:drawing>
+            <wp:anchor distT="0" distB="0" distL="0" distR="0" simplePos="0" relativeHeight="251661312" behindDoc="0" locked="0" layoutInCell="1" allowOverlap="1" wp14:anchorId="03866CB4" wp14:editId="3012B905">
+              <wp:simplePos x="635" y="635"/>
+              <wp:positionH relativeFrom="page">
+                <wp:align>center</wp:align>
+              </wp:positionH>
+              <wp:positionV relativeFrom="page">
+                <wp:align>bottom</wp:align>
+              </wp:positionV>
+              <wp:extent cx="622300" cy="376555"/>
+              <wp:effectExtent l="0" t="0" r="6350" b="0"/>
+              <wp:wrapNone/>
+              <wp:docPr id="361995272" name="Text Box 4" descr="OFFICIAL">
+                <a:extLst xmlns:a="http://schemas.openxmlformats.org/drawingml/2006/main">
+                  <a:ext uri="{5AE41FA2-C0FF-4470-9BD4-5FADCA87CBE2}">
+                    <aclsh:classification xmlns:aclsh="http://schemas.microsoft.com/office/drawing/2020/classificationShape" classificationOutcomeType="ftr"/>
+                  </a:ext>
+                </a:extLst>
+              </wp:docPr>
+              <wp:cNvGraphicFramePr/>
+              <a:graphic xmlns:a="http://schemas.openxmlformats.org/drawingml/2006/main">
+                <a:graphicData uri="http://schemas.microsoft.com/office/word/2010/wordprocessingShape">
+                  <wps:wsp>
+                    <wps:cNvSpPr txBox="1"/>
+                    <wps:spPr>
+                      <a:xfrm>
+                        <a:off x="0" y="0"/>
+                        <a:ext cx="622300" cy="376555"/>
+                      </a:xfrm>
+                      <a:prstGeom prst="rect">
+                        <a:avLst/>
+                      </a:prstGeom>
+                      <a:noFill/>
+                      <a:ln>
+                        <a:noFill/>
+                      </a:ln>
+                    </wps:spPr>
+                    <wps:txbx>
+                      <w:txbxContent>
+                        <w:p>
+                          <w:pPr>
+                            <w:rPr>
+                              <w:rFonts w:ascii="Aptos" w:eastAsia="Aptos" w:hAnsi="Aptos" w:cs="Aptos"/>
+                              <w:noProof/>
+                              <w:color w:val="FF0000"/>
+                              <w:sz w:val="24"/>
+                              <w:szCs w:val="24"/>
+                            </w:rPr>
+                          </w:pPr>
+                          <w:r>
+                            <w:rPr>
+                              <w:rFonts w:ascii="Aptos" w:eastAsia="Aptos" w:hAnsi="Aptos" w:cs="Aptos"/>
+                              <w:noProof/>
+                              <w:color w:val="FF0000"/>
+                              <w:sz w:val="24"/>
+                              <w:szCs w:val="24"/>
+                            </w:rPr>
+                            <w:t>OFFICIAL</w:t>
+                          </w:r>
+                        </w:p>
+                      </w:txbxContent>
+                    </wps:txbx>
+                    <wps:bodyPr rot="0" spcFirstLastPara="0" vertOverflow="overflow" horzOverflow="overflow" vert="horz" wrap="none" lIns="0" tIns="0" rIns="0" bIns="190500" numCol="1" spcCol="0" rtlCol="0" fromWordArt="0" anchor="b" anchorCtr="0" forceAA="0" compatLnSpc="1">
+                      <a:prstTxWarp prst="textNoShape">
+                        <a:avLst/>
+                      </a:prstTxWarp>
+                      <a:spAutoFit/>
+                    </wps:bodyPr>
+                  </wps:wsp>
+                </a:graphicData>
+              </a:graphic>
+            </wp:anchor>
+          </w:drawing>
+        </mc:Choice>
+        <mc:Fallback>
+          <w:pict>
+            <v:shapetype w14:anchorId="03866CB4" id="_x0000_t202" coordsize="21600,21600" o:spt="202" path="m,l,21600r21600,l21600,xe">
+              <v:stroke joinstyle="miter"/>
+              <v:path gradientshapeok="t" o:connecttype="rect"/>
+            </v:shapetype>
+            <v:shape id="Text Box 4" o:spid="_x0000_s1031" type="#_x0000_t202" alt="OFFICIAL" style="position:absolute;margin-left:0;margin-top:0;width:49pt;height:29.65pt;z-index:251661312;visibility:visible;mso-wrap-style:none;mso-wrap-distance-left:0;mso-wrap-distance-top:0;mso-wrap-distance-right:0;mso-wrap-distance-bottom:0;mso-position-horizontal:center;mso-position-horizontal-relative:page;mso-position-vertical:bottom;mso-position-vertical-relative:page;v-text-anchor:bottom" o:gfxdata="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" filled="f" stroked="f">
+              <v:fill o:detectmouseclick="t"/>
+              <v:textbox style="mso-fit-shape-to-text:t" inset="0,0,0,15pt">
+                <w:txbxContent>
+                  <w:p>
+                    <w:pPr>
+                      <w:rPr>
+                        <w:rFonts w:ascii="Aptos" w:eastAsia="Aptos" w:hAnsi="Aptos" w:cs="Aptos"/>
+                        <w:noProof/>
+                        <w:color w:val="FF0000"/>
+                        <w:sz w:val="24"/>
+                        <w:szCs w:val="24"/>
+                      </w:rPr>
+                    </w:pPr>
+                    <w:r>
+                      <w:rPr>
+                        <w:rFonts w:ascii="Aptos" w:eastAsia="Aptos" w:hAnsi="Aptos" w:cs="Aptos"/>
+                        <w:noProof/>
+                        <w:color w:val="FF0000"/>
+                        <w:sz w:val="24"/>
+                        <w:szCs w:val="24"/>
+                      </w:rPr>
+                      <w:t>OFFICIAL</w:t>
+                    </w:r>
+                  </w:p>
+                </w:txbxContent>
+              </v:textbox>
+              <w10:wrap anchorx="page" anchory="page"/>
+            </v:shape>
+          </w:pict>
+        </mc:Fallback>
+      </mc:AlternateContent>
+    </w:r>
+  </w:p>
+</w:ftr>
+</file>
+
+<file path=word/footnotes.xml><?xml version="1.0" encoding="utf-8"?>
+<w:footnotes xmlns:wpc="http://schemas.microsoft.com/office/word/2010/wordprocessingCanvas" xmlns:cx="http://schemas.microsoft.com/office/drawing/2014/chartex" xmlns:cx1="http://schemas.microsoft.com/office/drawing/2015/9/8/chartex" xmlns:cx2="http://schemas.microsoft.com/office/drawing/2015/10/21/chartex" xmlns:cx3="http://schemas.microsoft.com/office/drawing/2016/5/9/chartex" xmlns:cx4="http://schemas.microsoft.com/office/drawing/2016/5/10/chartex" xmlns:cx5="http://schemas.microsoft.com/office/drawing/2016/5/11/chartex" xmlns:cx6="http://schemas.microsoft.com/office/drawing/2016/5/12/chartex" xmlns:cx7="http://schemas.microsoft.com/office/drawing/2016/5/13/chartex" xmlns:cx8="http://schemas.microsoft.com/office/drawing/2016/5/14/chartex" xmlns:mc="http://schemas.openxmlformats.org/markup-compatibility/2006" xmlns:aink="http://schemas.microsoft.com/office/drawing/2016/ink" xmlns:am3d="http://schemas.microsoft.com/office/drawing/2017/model3d" xmlns:o="urn:schemas-microsoft-com:office:office" xmlns:oel="http://schemas.microsoft.com/office/2019/extlst" xmlns:r="http://schemas.openxmlformats.org/officeDocument/2006/relationships" xmlns:m="http://schemas.openxmlformats.org/officeDocument/2006/math" xmlns:v="urn:schemas-microsoft-com:vml" xmlns:wp14="http://schemas.microsoft.com/office/word/2010/wordprocessingDrawing" xmlns:wp="http://schemas.openxmlformats.org/drawingml/2006/wordprocessingDrawing" xmlns:w10="urn:schemas-microsoft-com:office:word" xmlns:w="http://schemas.openxmlformats.org/wordprocessingml/2006/main" xmlns:w14="http://schemas.microsoft.com/office/word/2010/wordml" xmlns:w15="http://schemas.microsoft.com/office/word/2012/wordml" xmlns:w16cex="http://schemas.microsoft.com/office/word/2018/wordml/cex" xmlns:w16cid="http://schemas.microsoft.com/office/word/2016/wordml/cid" xmlns:w16="http://schemas.microsoft.com/office/word/2018/wordml" xmlns:w16du="http://schemas.microsoft.com/office/word/2023/wordml/word16du" xmlns:w16sdtdh="http://schemas.microsoft.com/office/word/2020/wordml/sdtdatahash" xmlns:w16sdtfl="http://schemas.microsoft.com/office/word/2024/wordml/sdtformatlock" xmlns:w16se="http://schemas.microsoft.com/office/word/2015/wordml/symex" xmlns:wpg="http://schemas.microsoft.com/office/word/2010/wordprocessingGroup" xmlns:wpi="http://schemas.microsoft.com/office/word/2010/wordprocessingInk" xmlns:wne="http://schemas.microsoft.com/office/word/2006/wordml" xmlns:wps="http://schemas.microsoft.com/office/word/2010/wordprocessingShape" mc:Ignorable="w14 w15 w16se w16cid w16 w16cex w16sdtdh w16sdtfl w16du wp14">
+  <w:footnote w:type="separator" w:id="-1">
+    <w:p>
+      <w:r>
+        <w:separator/>
+      </w:r>
+    </w:p>
+  </w:footnote>
+  <w:footnote w:type="continuationSeparator" w:id="0">
+    <w:p>
+      <w:r>
+        <w:continuationSeparator/>
+      </w:r>
+    </w:p>
+  </w:footnote>
+</w:footnotes>
+</file>
+
+<file path=word/header1.xml><?xml version="1.0" encoding="utf-8"?>
+<w:hdr xmlns:wpc="http://schemas.microsoft.com/office/word/2010/wordprocessingCanvas" xmlns:cx="http://schemas.microsoft.com/office/drawing/2014/chartex" xmlns:cx1="http://schemas.microsoft.com/office/drawing/2015/9/8/chartex" xmlns:cx2="http://schemas.microsoft.com/office/drawing/2015/10/21/chartex" xmlns:cx3="http://schemas.microsoft.com/office/drawing/2016/5/9/chartex" xmlns:cx4="http://schemas.microsoft.com/office/drawing/2016/5/10/chartex" xmlns:cx5="http://schemas.microsoft.com/office/drawing/2016/5/11/chartex" xmlns:cx6="http://schemas.microsoft.com/office/drawing/2016/5/12/chartex" xmlns:cx7="http://schemas.microsoft.com/office/drawing/2016/5/13/chartex" xmlns:cx8="http://schemas.microsoft.com/office/drawing/2016/5/14/chartex" xmlns:mc="http://schemas.openxmlformats.org/markup-compatibility/2006" xmlns:aink="http://schemas.microsoft.com/office/drawing/2016/ink" xmlns:am3d="http://schemas.microsoft.com/office/drawing/2017/model3d" xmlns:o="urn:schemas-microsoft-com:office:office" xmlns:oel="http://schemas.microsoft.com/office/2019/extlst" xmlns:r="http://schemas.openxmlformats.org/officeDocument/2006/relationships" xmlns:m="http://schemas.openxmlformats.org/officeDocument/2006/math" xmlns:v="urn:schemas-microsoft-com:vml" xmlns:wp14="http://schemas.microsoft.com/office/word/2010/wordprocessingDrawing" xmlns:wp="http://schemas.openxmlformats.org/drawingml/2006/wordprocessingDrawing" xmlns:w10="urn:schemas-microsoft-com:office:word" xmlns:w="http://schemas.openxmlformats.org/wordprocessingml/2006/main" xmlns:w14="http://schemas.microsoft.com/office/word/2010/wordml" xmlns:w15="http://schemas.microsoft.com/office/word/2012/wordml" xmlns:w16cex="http://schemas.microsoft.com/office/word/2018/wordml/cex" xmlns:w16cid="http://schemas.microsoft.com/office/word/2016/wordml/cid" xmlns:w16="http://schemas.microsoft.com/office/word/2018/wordml" xmlns:w16du="http://schemas.microsoft.com/office/word/2023/wordml/word16du" xmlns:w16sdtdh="http://schemas.microsoft.com/office/word/2020/wordml/sdtdatahash" xmlns:w16sdtfl="http://schemas.microsoft.com/office/word/2024/wordml/sdtformatlock" xmlns:w16se="http://schemas.microsoft.com/office/word/2015/wordml/symex" xmlns:wpg="http://schemas.microsoft.com/office/word/2010/wordprocessingGroup" xmlns:wpi="http://schemas.microsoft.com/office/word/2010/wordprocessingInk" xmlns:wne="http://schemas.microsoft.com/office/word/2006/wordml" xmlns:wps="http://schemas.microsoft.com/office/word/2010/wordprocessingShape" mc:Ignorable="w14 w15 w16se w16cid w16 w16cex w16sdtdh w16sdtfl w16du wp14">
+  <w:p>
+    <w:pPr>
+      <w:pStyle w:val="Header"/>
+    </w:pPr>
+    <w:r>
+      <w:rPr>
+        <w:noProof/>
+      </w:rPr>
+      <mc:AlternateContent>
+        <mc:Choice Requires="wps">
+          <w:drawing>
+            <wp:anchor distT="0" distB="0" distL="0" distR="0" simplePos="0" relativeHeight="251659264" behindDoc="0" locked="0" layoutInCell="1" allowOverlap="1" wp14:anchorId="1A5521BF" wp14:editId="301FE53E">
+              <wp:simplePos x="635" y="635"/>
+              <wp:positionH relativeFrom="page">
+                <wp:align>center</wp:align>
+              </wp:positionH>
+              <wp:positionV relativeFrom="page">
+                <wp:align>top</wp:align>
+              </wp:positionV>
+              <wp:extent cx="622300" cy="376555"/>
+              <wp:effectExtent l="0" t="0" r="6350" b="4445"/>
+              <wp:wrapNone/>
+              <wp:docPr id="780581483" name="Text Box 2" descr="OFFICIAL">
+                <a:extLst xmlns:a="http://schemas.openxmlformats.org/drawingml/2006/main">
+                  <a:ext uri="{5AE41FA2-C0FF-4470-9BD4-5FADCA87CBE2}">
+                    <aclsh:classification xmlns:aclsh="http://schemas.microsoft.com/office/drawing/2020/classificationShape" classificationOutcomeType="hdr"/>
+                  </a:ext>
+                </a:extLst>
+              </wp:docPr>
+              <wp:cNvGraphicFramePr/>
+              <a:graphic xmlns:a="http://schemas.openxmlformats.org/drawingml/2006/main">
+                <a:graphicData uri="http://schemas.microsoft.com/office/word/2010/wordprocessingShape">
+                  <wps:wsp>
+                    <wps:cNvSpPr txBox="1"/>
+                    <wps:spPr>
+                      <a:xfrm>
+                        <a:off x="0" y="0"/>
+                        <a:ext cx="622300" cy="376555"/>
+                      </a:xfrm>
+                      <a:prstGeom prst="rect">
+                        <a:avLst/>
+                      </a:prstGeom>
+                      <a:noFill/>
+                      <a:ln>
+                        <a:noFill/>
+                      </a:ln>
+                    </wps:spPr>
+                    <wps:txbx>
+                      <w:txbxContent>
+                        <w:p>
+                          <w:pPr>
+                            <w:rPr>
+                              <w:rFonts w:ascii="Aptos" w:eastAsia="Aptos" w:hAnsi="Aptos" w:cs="Aptos"/>
+                              <w:noProof/>
+                              <w:color w:val="FF0000"/>
+                              <w:sz w:val="24"/>
+                              <w:szCs w:val="24"/>
+                            </w:rPr>
+                          </w:pPr>
+                          <w:r>
+                            <w:rPr>
+                              <w:rFonts w:ascii="Aptos" w:eastAsia="Aptos" w:hAnsi="Aptos" w:cs="Aptos"/>
+                              <w:noProof/>
+                              <w:color w:val="FF0000"/>
+                              <w:sz w:val="24"/>
+                              <w:szCs w:val="24"/>
+                            </w:rPr>
+                            <w:t>OFFICIAL</w:t>
+                          </w:r>
+                        </w:p>
+                      </w:txbxContent>
+                    </wps:txbx>
+                    <wps:bodyPr rot="0" spcFirstLastPara="0" vertOverflow="overflow" horzOverflow="overflow" vert="horz" wrap="none" lIns="0" tIns="190500" rIns="0" bIns="0" numCol="1" spcCol="0" rtlCol="0" fromWordArt="0" anchor="t" anchorCtr="0" forceAA="0" compatLnSpc="1">
+                      <a:prstTxWarp prst="textNoShape">
+                        <a:avLst/>
+                      </a:prstTxWarp>
+                      <a:spAutoFit/>
+                    </wps:bodyPr>
+                  </wps:wsp>
+                </a:graphicData>
+              </a:graphic>
+            </wp:anchor>
+          </w:drawing>
+        </mc:Choice>
+        <mc:Fallback>
+          <w:pict>
+            <v:shapetype w14:anchorId="1A5521BF" id="_x0000_t202" coordsize="21600,21600" o:spt="202" path="m,l,21600r21600,l21600,xe">
+              <v:stroke joinstyle="miter"/>
+              <v:path gradientshapeok="t" o:connecttype="rect"/>
+            </v:shapetype>
+            <v:shape id="Text Box 2" o:spid="_x0000_s1026" type="#_x0000_t202" alt="OFFICIAL" style="position:absolute;margin-left:0;margin-top:0;width:49pt;height:29.65pt;z-index:251659264;visibility:visible;mso-wrap-style:none;mso-wrap-distance-left:0;mso-wrap-distance-top:0;mso-wrap-distance-right:0;mso-wrap-distance-bottom:0;mso-position-horizontal:center;mso-position-horizontal-relative:page;mso-position-vertical:top;mso-position-vertical-relative:page;v-text-anchor:top" o:gfxdata="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" filled="f" stroked="f">
+              <v:fill o:detectmouseclick="t"/>
+              <v:textbox style="mso-fit-shape-to-text:t" inset="0,15pt,0,0">
+                <w:txbxContent>
+                  <w:p>
+                    <w:pPr>
+                      <w:rPr>
+                        <w:rFonts w:ascii="Aptos" w:eastAsia="Aptos" w:hAnsi="Aptos" w:cs="Aptos"/>
+                        <w:noProof/>
+                        <w:color w:val="FF0000"/>
+                        <w:sz w:val="24"/>
+                        <w:szCs w:val="24"/>
+                      </w:rPr>
+                    </w:pPr>
+                    <w:r>
+                      <w:rPr>
+                        <w:rFonts w:ascii="Aptos" w:eastAsia="Aptos" w:hAnsi="Aptos" w:cs="Aptos"/>
+                        <w:noProof/>
+                        <w:color w:val="FF0000"/>
+                        <w:sz w:val="24"/>
+                        <w:szCs w:val="24"/>
+                      </w:rPr>
+                      <w:t>OFFICIAL</w:t>
+                    </w:r>
+                  </w:p>
+                </w:txbxContent>
+              </v:textbox>
+              <w10:wrap anchorx="page" anchory="page"/>
+            </v:shape>
+          </w:pict>
+        </mc:Fallback>
+      </mc:AlternateContent>
+    </w:r>
+  </w:p>
+</w:hdr>
+</file>
+
+<file path=word/header2.xml><?xml version="1.0" encoding="utf-8"?>
+<w:hdr xmlns:wpc="http://schemas.microsoft.com/office/word/2010/wordprocessingCanvas" xmlns:cx="http://schemas.microsoft.com/office/drawing/2014/chartex" xmlns:cx1="http://schemas.microsoft.com/office/drawing/2015/9/8/chartex" xmlns:cx2="http://schemas.microsoft.com/office/drawing/2015/10/21/chartex" xmlns:cx3="http://schemas.microsoft.com/office/drawing/2016/5/9/chartex" xmlns:cx4="http://schemas.microsoft.com/office/drawing/2016/5/10/chartex" xmlns:cx5="http://schemas.microsoft.com/office/drawing/2016/5/11/chartex" xmlns:cx6="http://schemas.microsoft.com/office/drawing/2016/5/12/chartex" xmlns:cx7="http://schemas.microsoft.com/office/drawing/2016/5/13/chartex" xmlns:cx8="http://schemas.microsoft.com/office/drawing/2016/5/14/chartex" xmlns:mc="http://schemas.openxmlformats.org/markup-compatibility/2006" xmlns:aink="http://schemas.microsoft.com/office/drawing/2016/ink" xmlns:am3d="http://schemas.microsoft.com/office/drawing/2017/model3d" xmlns:o="urn:schemas-microsoft-com:office:office" xmlns:oel="http://schemas.microsoft.com/office/2019/extlst" xmlns:r="http://schemas.openxmlformats.org/officeDocument/2006/relationships" xmlns:m="http://schemas.openxmlformats.org/officeDocument/2006/math" xmlns:v="urn:schemas-microsoft-com:vml" xmlns:wp14="http://schemas.microsoft.com/office/word/2010/wordprocessingDrawing" xmlns:wp="http://schemas.openxmlformats.org/drawingml/2006/wordprocessingDrawing" xmlns:w10="urn:schemas-microsoft-com:office:word" xmlns:w="http://schemas.openxmlformats.org/wordprocessingml/2006/main" xmlns:w14="http://schemas.microsoft.com/office/word/2010/wordml" xmlns:w15="http://schemas.microsoft.com/office/word/2012/wordml" xmlns:w16cex="http://schemas.microsoft.com/office/word/2018/wordml/cex" xmlns:w16cid="http://schemas.microsoft.com/office/word/2016/wordml/cid" xmlns:w16="http://schemas.microsoft.com/office/word/2018/wordml" xmlns:w16du="http://schemas.microsoft.com/office/word/2023/wordml/word16du" xmlns:w16sdtdh="http://schemas.microsoft.com/office/word/2020/wordml/sdtdatahash" xmlns:w16sdtfl="http://schemas.microsoft.com/office/word/2024/wordml/sdtformatlock" xmlns:w16se="http://schemas.microsoft.com/office/word/2015/wordml/symex" xmlns:wpg="http://schemas.microsoft.com/office/word/2010/wordprocessingGroup" xmlns:wpi="http://schemas.microsoft.com/office/word/2010/wordprocessingInk" xmlns:wne="http://schemas.microsoft.com/office/word/2006/wordml" xmlns:wps="http://schemas.microsoft.com/office/word/2010/wordprocessingShape" mc:Ignorable="w14 w15 w16se w16cid w16 w16cex w16sdtdh w16sdtfl w16du wp14">
+  <w:p>
+    <w:pPr>
+      <w:pStyle w:val="Header"/>
+    </w:pPr>
+    <w:r>
+      <w:rPr>
+        <w:noProof/>
+      </w:rPr>
+      <mc:AlternateContent>
+        <mc:Choice Requires="wps">
+          <w:drawing>
+            <wp:anchor distT="0" distB="0" distL="0" distR="0" simplePos="0" relativeHeight="251660288" behindDoc="0" locked="0" layoutInCell="1" allowOverlap="1" wp14:anchorId="647FF740" wp14:editId="0AA5B94F">
+              <wp:simplePos x="690113" y="445986"/>
+              <wp:positionH relativeFrom="page">
+                <wp:align>center</wp:align>
+              </wp:positionH>
+              <wp:positionV relativeFrom="page">
+                <wp:align>top</wp:align>
+              </wp:positionV>
+              <wp:extent cx="622300" cy="376555"/>
+              <wp:effectExtent l="0" t="0" r="6350" b="4445"/>
+              <wp:wrapNone/>
+              <wp:docPr id="1195336046" name="Text Box 3" descr="OFFICIAL">
+                <a:extLst xmlns:a="http://schemas.openxmlformats.org/drawingml/2006/main">
+                  <a:ext uri="{5AE41FA2-C0FF-4470-9BD4-5FADCA87CBE2}">
+                    <aclsh:classification xmlns:aclsh="http://schemas.microsoft.com/office/drawing/2020/classificationShape" classificationOutcomeType="hdr"/>
+                  </a:ext>
+                </a:extLst>
+              </wp:docPr>
+              <wp:cNvGraphicFramePr/>
+              <a:graphic xmlns:a="http://schemas.openxmlformats.org/drawingml/2006/main">
+                <a:graphicData uri="http://schemas.microsoft.com/office/word/2010/wordprocessingShape">
+                  <wps:wsp>
+                    <wps:cNvSpPr txBox="1"/>
+                    <wps:spPr>
+                      <a:xfrm>
+                        <a:off x="0" y="0"/>
+                        <a:ext cx="622300" cy="376555"/>
+                      </a:xfrm>
+                      <a:prstGeom prst="rect">
+                        <a:avLst/>
+                      </a:prstGeom>
+                      <a:noFill/>
+                      <a:ln>
+                        <a:noFill/>
+                      </a:ln>
+                    </wps:spPr>
+                    <wps:txbx>
+                      <w:txbxContent>
+                        <w:p>
+                          <w:pPr>
+                            <w:rPr>
+                              <w:rFonts w:ascii="Aptos" w:eastAsia="Aptos" w:hAnsi="Aptos" w:cs="Aptos"/>
+                              <w:noProof/>
+                              <w:color w:val="FF0000"/>
+                              <w:sz w:val="24"/>
+                              <w:szCs w:val="24"/>
+                            </w:rPr>
+                          </w:pPr>
+                          <w:r>
+                            <w:rPr>
+                              <w:rFonts w:ascii="Aptos" w:eastAsia="Aptos" w:hAnsi="Aptos" w:cs="Aptos"/>
+                              <w:noProof/>
+                              <w:color w:val="FF0000"/>
+                              <w:sz w:val="24"/>
+                              <w:szCs w:val="24"/>
+                            </w:rPr>
+                            <w:t>OFFICIAL</w:t>
+                          </w:r>
+                        </w:p>
+                      </w:txbxContent>
+                    </wps:txbx>
+                    <wps:bodyPr rot="0" spcFirstLastPara="0" vertOverflow="overflow" horzOverflow="overflow" vert="horz" wrap="none" lIns="0" tIns="190500" rIns="0" bIns="0" numCol="1" spcCol="0" rtlCol="0" fromWordArt="0" anchor="t" anchorCtr="0" forceAA="0" compatLnSpc="1">
+                      <a:prstTxWarp prst="textNoShape">
+                        <a:avLst/>
+                      </a:prstTxWarp>
+                      <a:spAutoFit/>
+                    </wps:bodyPr>
+                  </wps:wsp>
+                </a:graphicData>
+              </a:graphic>
+            </wp:anchor>
+          </w:drawing>
+        </mc:Choice>
+        <mc:Fallback>
+          <w:pict>
+            <v:shapetype w14:anchorId="647FF740" id="_x0000_t202" coordsize="21600,21600" o:spt="202" path="m,l,21600r21600,l21600,xe">
+              <v:stroke joinstyle="miter"/>
+              <v:path gradientshapeok="t" o:connecttype="rect"/>
+            </v:shapetype>
+            <v:shape id="Text Box 3" o:spid="_x0000_s1027" type="#_x0000_t202" alt="OFFICIAL" style="position:absolute;margin-left:0;margin-top:0;width:49pt;height:29.65pt;z-index:251660288;visibility:visible;mso-wrap-style:none;mso-wrap-distance-left:0;mso-wrap-distance-top:0;mso-wrap-distance-right:0;mso-wrap-distance-bottom:0;mso-position-horizontal:center;mso-position-horizontal-relative:page;mso-position-vertical:top;mso-position-vertical-relative:page;v-text-anchor:top" o:gfxdata="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" filled="f" stroked="f">
+              <v:fill o:detectmouseclick="t"/>
+              <v:textbox style="mso-fit-shape-to-text:t" inset="0,15pt,0,0">
+                <w:txbxContent>
+                  <w:p>
+                    <w:pPr>
+                      <w:rPr>
+                        <w:rFonts w:ascii="Aptos" w:eastAsia="Aptos" w:hAnsi="Aptos" w:cs="Aptos"/>
+                        <w:noProof/>
+                        <w:color w:val="FF0000"/>
+                        <w:sz w:val="24"/>
+                        <w:szCs w:val="24"/>
+                      </w:rPr>
+                    </w:pPr>
+                    <w:r>
+                      <w:rPr>
+                        <w:rFonts w:ascii="Aptos" w:eastAsia="Aptos" w:hAnsi="Aptos" w:cs="Aptos"/>
+                        <w:noProof/>
+                        <w:color w:val="FF0000"/>
+                        <w:sz w:val="24"/>
+                        <w:szCs w:val="24"/>
+                      </w:rPr>
+                      <w:t>OFFICIAL</w:t>
+                    </w:r>
+                  </w:p>
+                </w:txbxContent>
+              </v:textbox>
+              <w10:wrap anchorx="page" anchory="page"/>
+            </v:shape>
+          </w:pict>
+        </mc:Fallback>
+      </mc:AlternateContent>
+    </w:r>
+  </w:p>
+</w:hdr>
+</file>
+
+<file path=word/header3.xml><?xml version="1.0" encoding="utf-8"?>
+<w:hdr xmlns:wpc="http://schemas.microsoft.com/office/word/2010/wordprocessingCanvas" xmlns:cx="http://schemas.microsoft.com/office/drawing/2014/chartex" xmlns:cx1="http://schemas.microsoft.com/office/drawing/2015/9/8/chartex" xmlns:cx2="http://schemas.microsoft.com/office/drawing/2015/10/21/chartex" xmlns:cx3="http://schemas.microsoft.com/office/drawing/2016/5/9/chartex" xmlns:cx4="http://schemas.microsoft.com/office/drawing/2016/5/10/chartex" xmlns:cx5="http://schemas.microsoft.com/office/drawing/2016/5/11/chartex" xmlns:cx6="http://schemas.microsoft.com/office/drawing/2016/5/12/chartex" xmlns:cx7="http://schemas.microsoft.com/office/drawing/2016/5/13/chartex" xmlns:cx8="http://schemas.microsoft.com/office/drawing/2016/5/14/chartex" xmlns:mc="http://schemas.openxmlformats.org/markup-compatibility/2006" xmlns:aink="http://schemas.microsoft.com/office/drawing/2016/ink" xmlns:am3d="http://schemas.microsoft.com/office/drawing/2017/model3d" xmlns:o="urn:schemas-microsoft-com:office:office" xmlns:oel="http://schemas.microsoft.com/office/2019/extlst" xmlns:r="http://schemas.openxmlformats.org/officeDocument/2006/relationships" xmlns:m="http://schemas.openxmlformats.org/officeDocument/2006/math" xmlns:v="urn:schemas-microsoft-com:vml" xmlns:wp14="http://schemas.microsoft.com/office/word/2010/wordprocessingDrawing" xmlns:wp="http://schemas.openxmlformats.org/drawingml/2006/wordprocessingDrawing" xmlns:w10="urn:schemas-microsoft-com:office:word" xmlns:w="http://schemas.openxmlformats.org/wordprocessingml/2006/main" xmlns:w14="http://schemas.microsoft.com/office/word/2010/wordml" xmlns:w15="http://schemas.microsoft.com/office/word/2012/wordml" xmlns:w16cex="http://schemas.microsoft.com/office/word/2018/wordml/cex" xmlns:w16cid="http://schemas.microsoft.com/office/word/2016/wordml/cid" xmlns:w16="http://schemas.microsoft.com/office/word/2018/wordml" xmlns:w16du="http://schemas.microsoft.com/office/word/2023/wordml/word16du" xmlns:w16sdtdh="http://schemas.microsoft.com/office/word/2020/wordml/sdtdatahash" xmlns:w16sdtfl="http://schemas.microsoft.com/office/word/2024/wordml/sdtformatlock" xmlns:w16se="http://schemas.microsoft.com/office/word/2015/wordml/symex" xmlns:wpg="http://schemas.microsoft.com/office/word/2010/wordprocessingGroup" xmlns:wpi="http://schemas.microsoft.com/office/word/2010/wordprocessingInk" xmlns:wne="http://schemas.microsoft.com/office/word/2006/wordml" xmlns:wps="http://schemas.microsoft.com/office/word/2010/wordprocessingShape" mc:Ignorable="w14 w15 w16se w16cid w16 w16cex w16sdtdh w16sdtfl w16du wp14">
+  <w:p>
+    <w:pPr>
+      <w:pStyle w:val="Header"/>
+    </w:pPr>
+    <w:r>
+      <w:rPr>
+        <w:noProof/>
+      </w:rPr>
+      <mc:AlternateContent>
+        <mc:Choice Requires="wps">
+          <w:drawing>
+            <wp:anchor distT="0" distB="0" distL="0" distR="0" simplePos="0" relativeHeight="251658240" behindDoc="0" locked="0" layoutInCell="1" allowOverlap="1" wp14:anchorId="69F45087" wp14:editId="626A4F4F">
+              <wp:simplePos x="635" y="635"/>
+              <wp:positionH relativeFrom="page">
+                <wp:align>center</wp:align>
+              </wp:positionH>
+              <wp:positionV relativeFrom="page">
+                <wp:align>top</wp:align>
+              </wp:positionV>
+              <wp:extent cx="622300" cy="376555"/>
+              <wp:effectExtent l="0" t="0" r="6350" b="4445"/>
+              <wp:wrapNone/>
+              <wp:docPr id="793840497" name="Text Box 1" descr="OFFICIAL">
+                <a:extLst xmlns:a="http://schemas.openxmlformats.org/drawingml/2006/main">
+                  <a:ext uri="{5AE41FA2-C0FF-4470-9BD4-5FADCA87CBE2}">
+                    <aclsh:classification xmlns:aclsh="http://schemas.microsoft.com/office/drawing/2020/classificationShape" classificationOutcomeType="hdr"/>
+                  </a:ext>
+                </a:extLst>
+              </wp:docPr>
+              <wp:cNvGraphicFramePr/>
+              <a:graphic xmlns:a="http://schemas.openxmlformats.org/drawingml/2006/main">
+                <a:graphicData uri="http://schemas.microsoft.com/office/word/2010/wordprocessingShape">
+                  <wps:wsp>
+                    <wps:cNvSpPr txBox="1"/>
+                    <wps:spPr>
+                      <a:xfrm>
+                        <a:off x="0" y="0"/>
+                        <a:ext cx="622300" cy="376555"/>
+                      </a:xfrm>
+                      <a:prstGeom prst="rect">
+                        <a:avLst/>
+                      </a:prstGeom>
+                      <a:noFill/>
+                      <a:ln>
+                        <a:noFill/>
+                      </a:ln>
+                    </wps:spPr>
+                    <wps:txbx>
+                      <w:txbxContent>
+                        <w:p>
+                          <w:pPr>
+                            <w:rPr>
+                              <w:rFonts w:ascii="Aptos" w:eastAsia="Aptos" w:hAnsi="Aptos" w:cs="Aptos"/>
+                              <w:noProof/>
+                              <w:color w:val="FF0000"/>
+                              <w:sz w:val="24"/>
+                              <w:szCs w:val="24"/>
+                            </w:rPr>
+                          </w:pPr>
+                          <w:r>
+                            <w:rPr>
+                              <w:rFonts w:ascii="Aptos" w:eastAsia="Aptos" w:hAnsi="Aptos" w:cs="Aptos"/>
+                              <w:noProof/>
+                              <w:color w:val="FF0000"/>
+                              <w:sz w:val="24"/>
+                              <w:szCs w:val="24"/>
+                            </w:rPr>
+                            <w:t>OFFICIAL</w:t>
+                          </w:r>
+                        </w:p>
+                      </w:txbxContent>
+                    </wps:txbx>
+                    <wps:bodyPr rot="0" spcFirstLastPara="0" vertOverflow="overflow" horzOverflow="overflow" vert="horz" wrap="none" lIns="0" tIns="190500" rIns="0" bIns="0" numCol="1" spcCol="0" rtlCol="0" fromWordArt="0" anchor="t" anchorCtr="0" forceAA="0" compatLnSpc="1">
+                      <a:prstTxWarp prst="textNoShape">
+                        <a:avLst/>
+                      </a:prstTxWarp>
+                      <a:spAutoFit/>
+                    </wps:bodyPr>
+                  </wps:wsp>
+                </a:graphicData>
+              </a:graphic>
+            </wp:anchor>
+          </w:drawing>
+        </mc:Choice>
+        <mc:Fallback>
+          <w:pict>
+            <v:shapetype w14:anchorId="69F45087" id="_x0000_t202" coordsize="21600,21600" o:spt="202" path="m,l,21600r21600,l21600,xe">
+              <v:stroke joinstyle="miter"/>
+              <v:path gradientshapeok="t" o:connecttype="rect"/>
+            </v:shapetype>
+            <v:shape id="Text Box 1" o:spid="_x0000_s1030" type="#_x0000_t202" alt="OFFICIAL" style="position:absolute;margin-left:0;margin-top:0;width:49pt;height:29.65pt;z-index:251658240;visibility:visible;mso-wrap-style:none;mso-wrap-distance-left:0;mso-wrap-distance-top:0;mso-wrap-distance-right:0;mso-wrap-distance-bottom:0;mso-position-horizontal:center;mso-position-horizontal-relative:page;mso-position-vertical:top;mso-position-vertical-relative:page;v-text-anchor:top" o:gfxdata="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" filled="f" stroked="f">
+              <v:fill o:detectmouseclick="t"/>
+              <v:textbox style="mso-fit-shape-to-text:t" inset="0,15pt,0,0">
+                <w:txbxContent>
+                  <w:p>
+                    <w:pPr>
+                      <w:rPr>
+                        <w:rFonts w:ascii="Aptos" w:eastAsia="Aptos" w:hAnsi="Aptos" w:cs="Aptos"/>
+                        <w:noProof/>
+                        <w:color w:val="FF0000"/>
+                        <w:sz w:val="24"/>
+                        <w:szCs w:val="24"/>
+                      </w:rPr>
+                    </w:pPr>
+                    <w:r>
+                      <w:rPr>
+                        <w:rFonts w:ascii="Aptos" w:eastAsia="Aptos" w:hAnsi="Aptos" w:cs="Aptos"/>
+                        <w:noProof/>
+                        <w:color w:val="FF0000"/>
+                        <w:sz w:val="24"/>
+                        <w:szCs w:val="24"/>
+                      </w:rPr>
+                      <w:t>OFFICIAL</w:t>
+                    </w:r>
+                  </w:p>
+                </w:txbxContent>
+              </v:textbox>
+              <w10:wrap anchorx="page" anchory="page"/>
+            </v:shape>
+          </w:pict>
+        </mc:Fallback>
+      </mc:AlternateContent>
+    </w:r>
+  </w:p>
+</w:hdr>
+</file>
+
 <file path=word/numbering.xml><?xml version="1.0" encoding="utf-8"?>
-<w:numbering xmlns:wpc="http://schemas.microsoft.com/office/word/2010/wordprocessingCanvas" xmlns:cx="http://schemas.microsoft.com/office/drawing/2014/chartex" xmlns:cx1="http://schemas.microsoft.com/office/drawing/2015/9/8/chartex" xmlns:cx2="http://schemas.microsoft.com/office/drawing/2015/10/21/chartex" xmlns:cx3="http://schemas.microsoft.com/office/drawing/2016/5/9/chartex" xmlns:cx4="http://schemas.microsoft.com/office/drawing/2016/5/10/chartex" xmlns:cx5="http://schemas.microsoft.com/office/drawing/2016/5/11/chartex" xmlns:cx6="http://schemas.microsoft.com/office/drawing/2016/5/12/chartex" xmlns:cx7="http://schemas.microsoft.com/office/drawing/2016/5/13/chartex" xmlns:cx8="http://schemas.microsoft.com/office/drawing/2016/5/14/chartex" xmlns:mc="http://schemas.openxmlformats.org/markup-compatibility/2006" xmlns:aink="http://schemas.microsoft.com/office/drawing/2016/ink" xmlns:am3d="http://schemas.microsoft.com/office/drawing/2017/model3d" xmlns:o="urn:schemas-microsoft-com:office:office" xmlns:r="http://schemas.openxmlformats.org/officeDocument/2006/relationships" xmlns:m="http://schemas.openxmlformats.org/officeDocument/2006/math" xmlns:v="urn:schemas-microsoft-com:vml" xmlns:wp14="http://schemas.microsoft.com/office/word/2010/wordprocessingDrawing" xmlns:wp="http://schemas.openxmlformats.org/drawingml/2006/wordprocessingDrawing" xmlns:w10="urn:schemas-microsoft-com:office:word" xmlns:w="http://schemas.openxmlformats.org/wordprocessingml/2006/main" xmlns:w14="http://schemas.microsoft.com/office/word/2010/wordml" xmlns:w15="http://schemas.microsoft.com/office/word/2012/wordml" xmlns:w16cid="http://schemas.microsoft.com/office/word/2016/wordml/cid" xmlns:w16se="http://schemas.microsoft.com/office/word/2015/wordml/symex" xmlns:wpg="http://schemas.microsoft.com/office/word/2010/wordprocessingGroup" xmlns:wpi="http://schemas.microsoft.com/office/word/2010/wordprocessingInk" xmlns:wne="http://schemas.microsoft.com/office/word/2006/wordml" xmlns:wps="http://schemas.microsoft.com/office/word/2010/wordprocessingShape" mc:Ignorable="w14 w15 w16se w16cid wp14">
+<w:numbering xmlns:wpc="http://schemas.microsoft.com/office/word/2010/wordprocessingCanvas" xmlns:cx="http://schemas.microsoft.com/office/drawing/2014/chartex" xmlns:cx1="http://schemas.microsoft.com/office/drawing/2015/9/8/chartex" xmlns:cx2="http://schemas.microsoft.com/office/drawing/2015/10/21/chartex" xmlns:cx3="http://schemas.microsoft.com/office/drawing/2016/5/9/chartex" xmlns:cx4="http://schemas.microsoft.com/office/drawing/2016/5/10/chartex" xmlns:cx5="http://schemas.microsoft.com/office/drawing/2016/5/11/chartex" xmlns:cx6="http://schemas.microsoft.com/office/drawing/2016/5/12/chartex" xmlns:cx7="http://schemas.microsoft.com/office/drawing/2016/5/13/chartex" xmlns:cx8="http://schemas.microsoft.com/office/drawing/2016/5/14/chartex" xmlns:mc="http://schemas.openxmlformats.org/markup-compatibility/2006" xmlns:aink="http://schemas.microsoft.com/office/drawing/2016/ink" xmlns:am3d="http://schemas.microsoft.com/office/drawing/2017/model3d" xmlns:o="urn:schemas-microsoft-com:office:office" xmlns:oel="http://schemas.microsoft.com/office/2019/extlst" xmlns:r="http://schemas.openxmlformats.org/officeDocument/2006/relationships" xmlns:m="http://schemas.openxmlformats.org/officeDocument/2006/math" xmlns:v="urn:schemas-microsoft-com:vml" xmlns:wp14="http://schemas.microsoft.com/office/word/2010/wordprocessingDrawing" xmlns:wp="http://schemas.openxmlformats.org/drawingml/2006/wordprocessingDrawing" xmlns:w10="urn:schemas-microsoft-com:office:word" xmlns:w="http://schemas.openxmlformats.org/wordprocessingml/2006/main" xmlns:w14="http://schemas.microsoft.com/office/word/2010/wordml" xmlns:w15="http://schemas.microsoft.com/office/word/2012/wordml" xmlns:w16cex="http://schemas.microsoft.com/office/word/2018/wordml/cex" xmlns:w16cid="http://schemas.microsoft.com/office/word/2016/wordml/cid" xmlns:w16="http://schemas.microsoft.com/office/word/2018/wordml" xmlns:w16du="http://schemas.microsoft.com/office/word/2023/wordml/word16du" xmlns:w16sdtdh="http://schemas.microsoft.com/office/word/2020/wordml/sdtdatahash" xmlns:w16sdtfl="http://schemas.microsoft.com/office/word/2024/wordml/sdtformatlock" xmlns:w16se="http://schemas.microsoft.com/office/word/2015/wordml/symex" xmlns:wpg="http://schemas.microsoft.com/office/word/2010/wordprocessingGroup" xmlns:wpi="http://schemas.microsoft.com/office/word/2010/wordprocessingInk" xmlns:wne="http://schemas.microsoft.com/office/word/2006/wordml" xmlns:wps="http://schemas.microsoft.com/office/word/2010/wordprocessingShape" mc:Ignorable="w14 w15 w16se w16cid w16 w16cex w16sdtdh w16sdtfl w16du wp14">
   <w:abstractNum w:abstractNumId="0" w15:restartNumberingAfterBreak="0">
     <w:nsid w:val="02D1476D"/>
     <w:multiLevelType w:val="hybridMultilevel"/>
@@ -8114,26 +8929,26 @@
       </w:pPr>
     </w:lvl>
   </w:abstractNum>
-  <w:num w:numId="1">
+  <w:num w:numId="1" w16cid:durableId="1647081274">
     <w:abstractNumId w:val="4"/>
   </w:num>
-  <w:num w:numId="2">
+  <w:num w:numId="2" w16cid:durableId="1330643887">
     <w:abstractNumId w:val="0"/>
   </w:num>
-  <w:num w:numId="3">
+  <w:num w:numId="3" w16cid:durableId="935939346">
     <w:abstractNumId w:val="3"/>
   </w:num>
-  <w:num w:numId="4">
+  <w:num w:numId="4" w16cid:durableId="1622225018">
     <w:abstractNumId w:val="1"/>
   </w:num>
-  <w:num w:numId="5">
+  <w:num w:numId="5" w16cid:durableId="628169857">
     <w:abstractNumId w:val="2"/>
   </w:num>
 </w:numbering>
 </file>
 
 <file path=word/styles.xml><?xml version="1.0" encoding="utf-8"?>
-<w:styles xmlns:mc="http://schemas.openxmlformats.org/markup-compatibility/2006" xmlns:r="http://schemas.openxmlformats.org/officeDocument/2006/relationships" xmlns:w="http://schemas.openxmlformats.org/wordprocessingml/2006/main" xmlns:w14="http://schemas.microsoft.com/office/word/2010/wordml" xmlns:w15="http://schemas.microsoft.com/office/word/2012/wordml" xmlns:w16cid="http://schemas.microsoft.com/office/word/2016/wordml/cid" xmlns:w16se="http://schemas.microsoft.com/office/word/2015/wordml/symex" mc:Ignorable="w14 w15 w16se w16cid">
+<w:styles xmlns:mc="http://schemas.openxmlformats.org/markup-compatibility/2006" xmlns:r="http://schemas.openxmlformats.org/officeDocument/2006/relationships" xmlns:w="http://schemas.openxmlformats.org/wordprocessingml/2006/main" xmlns:w14="http://schemas.microsoft.com/office/word/2010/wordml" xmlns:w15="http://schemas.microsoft.com/office/word/2012/wordml" xmlns:w16cex="http://schemas.microsoft.com/office/word/2018/wordml/cex" xmlns:w16cid="http://schemas.microsoft.com/office/word/2016/wordml/cid" xmlns:w16="http://schemas.microsoft.com/office/word/2018/wordml" xmlns:w16du="http://schemas.microsoft.com/office/word/2023/wordml/word16du" xmlns:w16sdtdh="http://schemas.microsoft.com/office/word/2020/wordml/sdtdatahash" xmlns:w16sdtfl="http://schemas.microsoft.com/office/word/2024/wordml/sdtformatlock" xmlns:w16se="http://schemas.microsoft.com/office/word/2015/wordml/symex" mc:Ignorable="w14 w15 w16se w16cid w16 w16cex w16sdtdh w16sdtfl w16du">
   <w:docDefaults>
     <w:rPrDefault>
       <w:rPr>
@@ -8149,7 +8964,7 @@
       </w:pPr>
     </w:pPrDefault>
   </w:docDefaults>
-  <w:latentStyles w:defLockedState="0" w:defUIPriority="99" w:defSemiHidden="0" w:defUnhideWhenUsed="0" w:defQFormat="0" w:count="377">
+  <w:latentStyles w:defLockedState="0" w:defUIPriority="99" w:defSemiHidden="0" w:defUnhideWhenUsed="0" w:defQFormat="0" w:count="376">
     <w:lsdException w:name="Normal" w:uiPriority="0" w:qFormat="1"/>
     <w:lsdException w:name="heading 1" w:uiPriority="0" w:qFormat="1"/>
     <w:lsdException w:name="heading 2" w:semiHidden="1" w:uiPriority="0" w:unhideWhenUsed="1" w:qFormat="1"/>
@@ -8304,7 +9119,7 @@
     <w:lsdException w:name="Table Web 2" w:semiHidden="1" w:unhideWhenUsed="1"/>
     <w:lsdException w:name="Table Web 3" w:semiHidden="1" w:unhideWhenUsed="1"/>
     <w:lsdException w:name="Balloon Text" w:semiHidden="1" w:unhideWhenUsed="1"/>
-    <w:lsdException w:name="Table Grid" w:semiHidden="1" w:uiPriority="59" w:unhideWhenUsed="1"/>
+    <w:lsdException w:name="Table Grid" w:uiPriority="59"/>
     <w:lsdException w:name="Table Theme" w:semiHidden="1" w:unhideWhenUsed="1"/>
     <w:lsdException w:name="Placeholder Text" w:semiHidden="1"/>
     <w:lsdException w:name="No Spacing" w:uiPriority="1" w:qFormat="1"/>
@@ -8526,7 +9341,6 @@
     <w:lsdException w:name="Hashtag" w:semiHidden="1" w:unhideWhenUsed="1"/>
     <w:lsdException w:name="Unresolved Mention" w:semiHidden="1" w:unhideWhenUsed="1"/>
     <w:lsdException w:name="Smart Link" w:semiHidden="1" w:unhideWhenUsed="1"/>
-    <w:lsdException w:name="Smart Link Error" w:semiHidden="1" w:unhideWhenUsed="1"/>
   </w:latentStyles>
   <w:style w:type="paragraph" w:default="1" w:styleId="Normal">
     <w:name w:val="Normal"/>

</xml_diff>